<commit_message>
initial commit on : 3/07/2026
</commit_message>
<xml_diff>
--- a/docs/exports/OVS_USER_MANUAL.docx
+++ b/docs/exports/OVS_USER_MANUAL.docx
@@ -7,7 +7,7 @@
         <w:pStyle w:val="Title"/>
       </w:pPr>
       <w:r>
-        <w:t xml:space="preserve">OVS User Manual</w:t>
+        <w:t xml:space="preserve">OVS + GAMS User Manual</w:t>
       </w:r>
     </w:p>
     <w:p>
@@ -15,7 +15,7 @@
         <w:pStyle w:val="Author"/>
       </w:pPr>
       <w:r>
-        <w:t xml:space="preserve">OVS Project Team</w:t>
+        <w:t xml:space="preserve">OVS + GAMS Project Team</w:t>
       </w:r>
     </w:p>
     <w:sdt>
@@ -44,13 +44,13 @@
         </w:p>
       </w:sdtContent>
     </w:sdt>
-    <w:bookmarkStart w:id="9" w:name="X932bfbb1bfb629683d8d18709338b053fe06112"/>
+    <w:bookmarkStart w:id="9" w:name="Xcce5529ecc228ad63d03c65498e56cadf3dd30c"/>
     <w:p>
       <w:pPr>
         <w:pStyle w:val="Heading1"/>
       </w:pPr>
       <w:r>
-        <w:t xml:space="preserve">OVS Comprehensive User Manual (Print Edition)</w:t>
+        <w:t xml:space="preserve">OVS + GAMS Comprehensive User Manual (Print Edition)</w:t>
       </w:r>
     </w:p>
     <w:p>
@@ -98,13 +98,13 @@
         <w:t xml:space="preserve">1) Getting Started</w:t>
       </w:r>
     </w:p>
-    <w:bookmarkStart w:id="10" w:name="X6543fc3d99183a61780367edfe7d2ed65617566"/>
+    <w:bookmarkStart w:id="10" w:name="Xdbcab1736944ade4f1b4534fb3af05242e98f61"/>
     <w:p>
       <w:pPr>
         <w:pStyle w:val="Heading2"/>
       </w:pPr>
       <w:r>
-        <w:t xml:space="preserve">1.1 What OVS Is</w:t>
+        <w:t xml:space="preserve">1.1 What the Platform Is</w:t>
       </w:r>
     </w:p>
     <w:p>
@@ -112,7 +112,7 @@
         <w:pStyle w:val="FirstParagraph"/>
       </w:pPr>
       <w:r>
-        <w:t xml:space="preserve">OVS is a web-based vetting platform that combines:</w:t>
+        <w:t xml:space="preserve">OVS-Redo is a web-based platform combining:</w:t>
       </w:r>
     </w:p>
     <w:p>
@@ -124,7 +124,7 @@
         </w:numPr>
       </w:pPr>
       <w:r>
-        <w:t xml:space="preserve">Process orchestration (campaigns, rubrics, case tracking),</w:t>
+        <w:t xml:space="preserve">OVS vetting orchestration (campaigns, rubrics, case tracking),</w:t>
       </w:r>
     </w:p>
     <w:p>
@@ -148,7 +148,7 @@
         </w:numPr>
       </w:pPr>
       <w:r>
-        <w:t xml:space="preserve">Human final decisions (approve, reject, escalate),</w:t>
+        <w:t xml:space="preserve">GAMS appointment governance (positions, personnel, approval chain, publication),</w:t>
       </w:r>
     </w:p>
     <w:p>
@@ -160,7 +160,7 @@
         </w:numPr>
       </w:pPr>
       <w:r>
-        <w:t xml:space="preserve">Administrative control and operational monitoring.</w:t>
+        <w:t xml:space="preserve">Human final authority and operational monitoring.</w:t>
       </w:r>
     </w:p>
     <w:bookmarkEnd w:id="10"/>
@@ -178,7 +178,7 @@
         <w:pStyle w:val="FirstParagraph"/>
       </w:pPr>
       <w:r>
-        <w:t xml:space="preserve">OVS can run in:</w:t>
+        <w:t xml:space="preserve">The platform can run in:</w:t>
       </w:r>
     </w:p>
     <w:p>
@@ -8646,6 +8646,21 @@
         <w:rPr>
           <w:rStyle w:val="VerbatimChar"/>
         </w:rPr>
+        <w:t xml:space="preserve">POST /api/notifications/{id}/restore/</w:t>
+      </w:r>
+    </w:p>
+    <w:p>
+      <w:pPr>
+        <w:pStyle w:val="Compact"/>
+        <w:numPr>
+          <w:ilvl w:val="0"/>
+          <w:numId w:val="1119"/>
+        </w:numPr>
+      </w:pPr>
+      <w:r>
+        <w:rPr>
+          <w:rStyle w:val="VerbatimChar"/>
+        </w:rPr>
         <w:t xml:space="preserve">POST /api/notifications/mark-as-read/</w:t>
       </w:r>
     </w:p>
@@ -8746,7 +8761,19 @@
         </w:numPr>
       </w:pPr>
       <w:r>
-        <w:t xml:space="preserve">Decision publication to candidates.</w:t>
+        <w:t xml:space="preserve">Candidate decision publication,</w:t>
+      </w:r>
+    </w:p>
+    <w:p>
+      <w:pPr>
+        <w:pStyle w:val="Compact"/>
+        <w:numPr>
+          <w:ilvl w:val="0"/>
+          <w:numId w:val="1120"/>
+        </w:numPr>
+      </w:pPr>
+      <w:r>
+        <w:t xml:space="preserve">Government appointment lifecycle events (nomination, stage moves, decision, publication, revocation).</w:t>
       </w:r>
     </w:p>
     <w:bookmarkEnd w:id="110"/>
@@ -8764,7 +8791,7 @@
         <w:pStyle w:val="FirstParagraph"/>
       </w:pPr>
       <w:r>
-        <w:t xml:space="preserve">Typical status progression:</w:t>
+        <w:t xml:space="preserve">OVS case progression (typical):</w:t>
       </w:r>
     </w:p>
     <w:p>
@@ -8875,6 +8902,157 @@
         <w:t xml:space="preserve">Candidate and stakeholders notified.</w:t>
       </w:r>
     </w:p>
+    <w:p>
+      <w:pPr>
+        <w:pStyle w:val="FirstParagraph"/>
+      </w:pPr>
+      <w:r>
+        <w:t xml:space="preserve">GAMS appointment progression (service-enforced transitions):</w:t>
+      </w:r>
+    </w:p>
+    <w:p>
+      <w:pPr>
+        <w:pStyle w:val="Compact"/>
+        <w:numPr>
+          <w:ilvl w:val="0"/>
+          <w:numId w:val="1123"/>
+        </w:numPr>
+      </w:pPr>
+      <w:r>
+        <w:rPr>
+          <w:rStyle w:val="VerbatimChar"/>
+        </w:rPr>
+        <w:t xml:space="preserve">nominated</w:t>
+      </w:r>
+    </w:p>
+    <w:p>
+      <w:pPr>
+        <w:pStyle w:val="Compact"/>
+        <w:numPr>
+          <w:ilvl w:val="0"/>
+          <w:numId w:val="1123"/>
+        </w:numPr>
+      </w:pPr>
+      <w:r>
+        <w:rPr>
+          <w:rStyle w:val="VerbatimChar"/>
+        </w:rPr>
+        <w:t xml:space="preserve">under_vetting</w:t>
+      </w:r>
+    </w:p>
+    <w:p>
+      <w:pPr>
+        <w:pStyle w:val="Compact"/>
+        <w:numPr>
+          <w:ilvl w:val="0"/>
+          <w:numId w:val="1123"/>
+        </w:numPr>
+      </w:pPr>
+      <w:r>
+        <w:rPr>
+          <w:rStyle w:val="VerbatimChar"/>
+        </w:rPr>
+        <w:t xml:space="preserve">committee_review</w:t>
+      </w:r>
+    </w:p>
+    <w:p>
+      <w:pPr>
+        <w:pStyle w:val="Compact"/>
+        <w:numPr>
+          <w:ilvl w:val="0"/>
+          <w:numId w:val="1123"/>
+        </w:numPr>
+      </w:pPr>
+      <w:r>
+        <w:rPr>
+          <w:rStyle w:val="VerbatimChar"/>
+        </w:rPr>
+        <w:t xml:space="preserve">confirmation_pending</w:t>
+      </w:r>
+    </w:p>
+    <w:p>
+      <w:pPr>
+        <w:pStyle w:val="Compact"/>
+        <w:numPr>
+          <w:ilvl w:val="0"/>
+          <w:numId w:val="1123"/>
+        </w:numPr>
+      </w:pPr>
+      <w:r>
+        <w:rPr>
+          <w:rStyle w:val="VerbatimChar"/>
+        </w:rPr>
+        <w:t xml:space="preserve">appointed</w:t>
+      </w:r>
+    </w:p>
+    <w:p>
+      <w:pPr>
+        <w:pStyle w:val="Compact"/>
+        <w:numPr>
+          <w:ilvl w:val="0"/>
+          <w:numId w:val="1123"/>
+        </w:numPr>
+      </w:pPr>
+      <w:r>
+        <w:rPr>
+          <w:rStyle w:val="VerbatimChar"/>
+        </w:rPr>
+        <w:t xml:space="preserve">serving</w:t>
+      </w:r>
+    </w:p>
+    <w:p>
+      <w:pPr>
+        <w:pStyle w:val="Compact"/>
+        <w:numPr>
+          <w:ilvl w:val="0"/>
+          <w:numId w:val="1123"/>
+        </w:numPr>
+      </w:pPr>
+      <w:r>
+        <w:rPr>
+          <w:rStyle w:val="VerbatimChar"/>
+        </w:rPr>
+        <w:t xml:space="preserve">exited</w:t>
+      </w:r>
+    </w:p>
+    <w:p>
+      <w:pPr>
+        <w:pStyle w:val="FirstParagraph"/>
+      </w:pPr>
+      <w:r>
+        <w:t xml:space="preserve">Alternative terminal outcomes:</w:t>
+      </w:r>
+    </w:p>
+    <w:p>
+      <w:pPr>
+        <w:pStyle w:val="Compact"/>
+        <w:numPr>
+          <w:ilvl w:val="0"/>
+          <w:numId w:val="1124"/>
+        </w:numPr>
+      </w:pPr>
+      <w:r>
+        <w:rPr>
+          <w:rStyle w:val="VerbatimChar"/>
+        </w:rPr>
+        <w:t xml:space="preserve">rejected</w:t>
+      </w:r>
+    </w:p>
+    <w:p>
+      <w:pPr>
+        <w:pStyle w:val="Compact"/>
+        <w:numPr>
+          <w:ilvl w:val="0"/>
+          <w:numId w:val="1124"/>
+        </w:numPr>
+      </w:pPr>
+      <w:r>
+        <w:rPr>
+          <w:rStyle w:val="VerbatimChar"/>
+        </w:rPr>
+        <w:t xml:space="preserve">withdrawn</w:t>
+      </w:r>
+    </w:p>
     <w:bookmarkEnd w:id="111"/>
     <w:bookmarkStart w:id="112" w:name="X137869f2d16944398c697196e34f523fe58d101"/>
     <w:p>
@@ -8898,7 +9076,7 @@
         <w:pStyle w:val="Compact"/>
         <w:numPr>
           <w:ilvl w:val="0"/>
-          <w:numId w:val="1123"/>
+          <w:numId w:val="1125"/>
         </w:numPr>
       </w:pPr>
       <w:r>
@@ -8910,7 +9088,7 @@
         <w:pStyle w:val="Compact"/>
         <w:numPr>
           <w:ilvl w:val="0"/>
-          <w:numId w:val="1123"/>
+          <w:numId w:val="1125"/>
         </w:numPr>
       </w:pPr>
       <w:r>
@@ -8922,7 +9100,7 @@
         <w:pStyle w:val="Compact"/>
         <w:numPr>
           <w:ilvl w:val="0"/>
-          <w:numId w:val="1123"/>
+          <w:numId w:val="1125"/>
         </w:numPr>
       </w:pPr>
       <w:r>
@@ -8934,11 +9112,23 @@
         <w:pStyle w:val="Compact"/>
         <w:numPr>
           <w:ilvl w:val="0"/>
-          <w:numId w:val="1123"/>
+          <w:numId w:val="1125"/>
         </w:numPr>
       </w:pPr>
       <w:r>
         <w:t xml:space="preserve">Add reviewer notes where required by policy.</w:t>
+      </w:r>
+    </w:p>
+    <w:p>
+      <w:pPr>
+        <w:pStyle w:val="Compact"/>
+        <w:numPr>
+          <w:ilvl w:val="0"/>
+          <w:numId w:val="1125"/>
+        </w:numPr>
+      </w:pPr>
+      <w:r>
+        <w:t xml:space="preserve">For appointments, ensure required approval stage context is attached when template policy requires it.</w:t>
       </w:r>
     </w:p>
     <w:bookmarkEnd w:id="112"/>
@@ -8964,7 +9154,7 @@
         <w:pStyle w:val="Compact"/>
         <w:numPr>
           <w:ilvl w:val="0"/>
-          <w:numId w:val="1124"/>
+          <w:numId w:val="1126"/>
         </w:numPr>
       </w:pPr>
       <w:r>
@@ -8976,7 +9166,7 @@
         <w:pStyle w:val="Compact"/>
         <w:numPr>
           <w:ilvl w:val="0"/>
-          <w:numId w:val="1124"/>
+          <w:numId w:val="1126"/>
         </w:numPr>
       </w:pPr>
       <w:r>
@@ -8988,7 +9178,7 @@
         <w:pStyle w:val="Compact"/>
         <w:numPr>
           <w:ilvl w:val="0"/>
-          <w:numId w:val="1124"/>
+          <w:numId w:val="1126"/>
         </w:numPr>
       </w:pPr>
       <w:r>
@@ -9000,11 +9190,47 @@
         <w:pStyle w:val="Compact"/>
         <w:numPr>
           <w:ilvl w:val="0"/>
-          <w:numId w:val="1124"/>
+          <w:numId w:val="1126"/>
         </w:numPr>
       </w:pPr>
       <w:r>
         <w:t xml:space="preserve">Correlate decision notifications with audit entries.</w:t>
+      </w:r>
+    </w:p>
+    <w:p>
+      <w:pPr>
+        <w:pStyle w:val="Compact"/>
+        <w:numPr>
+          <w:ilvl w:val="0"/>
+          <w:numId w:val="1126"/>
+        </w:numPr>
+      </w:pPr>
+      <w:r>
+        <w:t xml:space="preserve">For GAMS, track appointment event types in notification metadata (for example</w:t>
+      </w:r>
+      <w:r>
+        <w:t xml:space="preserve"> </w:t>
+      </w:r>
+      <w:r>
+        <w:rPr>
+          <w:rStyle w:val="VerbatimChar"/>
+        </w:rPr>
+        <w:t xml:space="preserve">appointment_published</w:t>
+      </w:r>
+      <w:r>
+        <w:t xml:space="preserve">,</w:t>
+      </w:r>
+      <w:r>
+        <w:t xml:space="preserve"> </w:t>
+      </w:r>
+      <w:r>
+        <w:rPr>
+          <w:rStyle w:val="VerbatimChar"/>
+        </w:rPr>
+        <w:t xml:space="preserve">appointment_revoked</w:t>
+      </w:r>
+      <w:r>
+        <w:t xml:space="preserve">).</w:t>
       </w:r>
     </w:p>
     <w:p>
@@ -9115,7 +9341,7 @@
         <w:pStyle w:val="Compact"/>
         <w:numPr>
           <w:ilvl w:val="0"/>
-          <w:numId w:val="1125"/>
+          <w:numId w:val="1127"/>
         </w:numPr>
       </w:pPr>
       <w:r>
@@ -9130,7 +9356,7 @@
         <w:pStyle w:val="Compact"/>
         <w:numPr>
           <w:ilvl w:val="0"/>
-          <w:numId w:val="1125"/>
+          <w:numId w:val="1127"/>
         </w:numPr>
       </w:pPr>
       <w:r>
@@ -9145,7 +9371,7 @@
         <w:pStyle w:val="Compact"/>
         <w:numPr>
           <w:ilvl w:val="0"/>
-          <w:numId w:val="1125"/>
+          <w:numId w:val="1127"/>
         </w:numPr>
       </w:pPr>
       <w:r>
@@ -9160,7 +9386,7 @@
         <w:pStyle w:val="Compact"/>
         <w:numPr>
           <w:ilvl w:val="0"/>
-          <w:numId w:val="1125"/>
+          <w:numId w:val="1127"/>
         </w:numPr>
       </w:pPr>
       <w:r>
@@ -9175,7 +9401,7 @@
         <w:pStyle w:val="Compact"/>
         <w:numPr>
           <w:ilvl w:val="0"/>
-          <w:numId w:val="1125"/>
+          <w:numId w:val="1127"/>
         </w:numPr>
       </w:pPr>
       <w:r>
@@ -9190,7 +9416,7 @@
         <w:pStyle w:val="Compact"/>
         <w:numPr>
           <w:ilvl w:val="0"/>
-          <w:numId w:val="1125"/>
+          <w:numId w:val="1127"/>
         </w:numPr>
       </w:pPr>
       <w:r>
@@ -10017,7 +10243,7 @@
         <w:pStyle w:val="Compact"/>
         <w:numPr>
           <w:ilvl w:val="0"/>
-          <w:numId w:val="1126"/>
+          <w:numId w:val="1128"/>
         </w:numPr>
       </w:pPr>
       <w:r>
@@ -10040,7 +10266,7 @@
         <w:pStyle w:val="Compact"/>
         <w:numPr>
           <w:ilvl w:val="0"/>
-          <w:numId w:val="1127"/>
+          <w:numId w:val="1129"/>
         </w:numPr>
       </w:pPr>
       <w:r>
@@ -10146,7 +10372,7 @@
         <w:pStyle w:val="Compact"/>
         <w:numPr>
           <w:ilvl w:val="0"/>
-          <w:numId w:val="1128"/>
+          <w:numId w:val="1130"/>
         </w:numPr>
       </w:pPr>
       <w:r>
@@ -10170,7 +10396,7 @@
         <w:pStyle w:val="Compact"/>
         <w:numPr>
           <w:ilvl w:val="0"/>
-          <w:numId w:val="1128"/>
+          <w:numId w:val="1130"/>
         </w:numPr>
       </w:pPr>
       <w:r>
@@ -10182,7 +10408,7 @@
         <w:pStyle w:val="Compact"/>
         <w:numPr>
           <w:ilvl w:val="0"/>
-          <w:numId w:val="1128"/>
+          <w:numId w:val="1130"/>
         </w:numPr>
       </w:pPr>
       <w:r>
@@ -10194,7 +10420,7 @@
         <w:pStyle w:val="Compact"/>
         <w:numPr>
           <w:ilvl w:val="0"/>
-          <w:numId w:val="1128"/>
+          <w:numId w:val="1130"/>
         </w:numPr>
       </w:pPr>
       <w:r>
@@ -10250,7 +10476,7 @@
         <w:pStyle w:val="Compact"/>
         <w:numPr>
           <w:ilvl w:val="0"/>
-          <w:numId w:val="1129"/>
+          <w:numId w:val="1131"/>
         </w:numPr>
       </w:pPr>
       <w:r>
@@ -10274,7 +10500,7 @@
         <w:pStyle w:val="Compact"/>
         <w:numPr>
           <w:ilvl w:val="0"/>
-          <w:numId w:val="1129"/>
+          <w:numId w:val="1131"/>
         </w:numPr>
       </w:pPr>
       <w:r>
@@ -10298,7 +10524,7 @@
         <w:pStyle w:val="Compact"/>
         <w:numPr>
           <w:ilvl w:val="0"/>
-          <w:numId w:val="1129"/>
+          <w:numId w:val="1131"/>
         </w:numPr>
       </w:pPr>
       <w:r>
@@ -10310,7 +10536,7 @@
         <w:pStyle w:val="Compact"/>
         <w:numPr>
           <w:ilvl w:val="0"/>
-          <w:numId w:val="1129"/>
+          <w:numId w:val="1131"/>
         </w:numPr>
       </w:pPr>
       <w:r>
@@ -10340,7 +10566,7 @@
         <w:pStyle w:val="Compact"/>
         <w:numPr>
           <w:ilvl w:val="0"/>
-          <w:numId w:val="1130"/>
+          <w:numId w:val="1132"/>
         </w:numPr>
       </w:pPr>
       <w:r>
@@ -10352,7 +10578,7 @@
         <w:pStyle w:val="Compact"/>
         <w:numPr>
           <w:ilvl w:val="0"/>
-          <w:numId w:val="1130"/>
+          <w:numId w:val="1132"/>
         </w:numPr>
       </w:pPr>
       <w:r>
@@ -10364,7 +10590,7 @@
         <w:pStyle w:val="Compact"/>
         <w:numPr>
           <w:ilvl w:val="0"/>
-          <w:numId w:val="1130"/>
+          <w:numId w:val="1132"/>
         </w:numPr>
       </w:pPr>
       <w:r>
@@ -10419,7 +10645,7 @@
         <w:pStyle w:val="Compact"/>
         <w:numPr>
           <w:ilvl w:val="0"/>
-          <w:numId w:val="1131"/>
+          <w:numId w:val="1133"/>
         </w:numPr>
       </w:pPr>
       <w:r>
@@ -10431,7 +10657,7 @@
         <w:pStyle w:val="Compact"/>
         <w:numPr>
           <w:ilvl w:val="0"/>
-          <w:numId w:val="1131"/>
+          <w:numId w:val="1133"/>
         </w:numPr>
       </w:pPr>
       <w:r>
@@ -10443,7 +10669,7 @@
         <w:pStyle w:val="Compact"/>
         <w:numPr>
           <w:ilvl w:val="0"/>
-          <w:numId w:val="1131"/>
+          <w:numId w:val="1133"/>
         </w:numPr>
       </w:pPr>
       <w:r>
@@ -10455,7 +10681,7 @@
         <w:pStyle w:val="Compact"/>
         <w:numPr>
           <w:ilvl w:val="0"/>
-          <w:numId w:val="1131"/>
+          <w:numId w:val="1133"/>
         </w:numPr>
       </w:pPr>
       <w:r>
@@ -10485,7 +10711,7 @@
         <w:pStyle w:val="Compact"/>
         <w:numPr>
           <w:ilvl w:val="0"/>
-          <w:numId w:val="1132"/>
+          <w:numId w:val="1134"/>
         </w:numPr>
       </w:pPr>
       <w:r>
@@ -10497,7 +10723,7 @@
         <w:pStyle w:val="Compact"/>
         <w:numPr>
           <w:ilvl w:val="0"/>
-          <w:numId w:val="1132"/>
+          <w:numId w:val="1134"/>
         </w:numPr>
       </w:pPr>
       <w:r>
@@ -10509,7 +10735,7 @@
         <w:pStyle w:val="Compact"/>
         <w:numPr>
           <w:ilvl w:val="0"/>
-          <w:numId w:val="1132"/>
+          <w:numId w:val="1134"/>
         </w:numPr>
       </w:pPr>
       <w:r>
@@ -10549,7 +10775,7 @@
         <w:pStyle w:val="Compact"/>
         <w:numPr>
           <w:ilvl w:val="0"/>
-          <w:numId w:val="1133"/>
+          <w:numId w:val="1135"/>
         </w:numPr>
       </w:pPr>
       <w:r>
@@ -10561,7 +10787,7 @@
         <w:pStyle w:val="Compact"/>
         <w:numPr>
           <w:ilvl w:val="0"/>
-          <w:numId w:val="1133"/>
+          <w:numId w:val="1135"/>
         </w:numPr>
       </w:pPr>
       <w:r>
@@ -10573,7 +10799,7 @@
         <w:pStyle w:val="Compact"/>
         <w:numPr>
           <w:ilvl w:val="0"/>
-          <w:numId w:val="1133"/>
+          <w:numId w:val="1135"/>
         </w:numPr>
       </w:pPr>
       <w:r>
@@ -10585,7 +10811,7 @@
         <w:pStyle w:val="Compact"/>
         <w:numPr>
           <w:ilvl w:val="0"/>
-          <w:numId w:val="1133"/>
+          <w:numId w:val="1135"/>
         </w:numPr>
       </w:pPr>
       <w:r>
@@ -10625,7 +10851,7 @@
         <w:pStyle w:val="Compact"/>
         <w:numPr>
           <w:ilvl w:val="0"/>
-          <w:numId w:val="1134"/>
+          <w:numId w:val="1136"/>
         </w:numPr>
       </w:pPr>
       <w:r>
@@ -10637,7 +10863,7 @@
         <w:pStyle w:val="Compact"/>
         <w:numPr>
           <w:ilvl w:val="0"/>
-          <w:numId w:val="1134"/>
+          <w:numId w:val="1136"/>
         </w:numPr>
       </w:pPr>
       <w:r>
@@ -10649,7 +10875,7 @@
         <w:pStyle w:val="Compact"/>
         <w:numPr>
           <w:ilvl w:val="0"/>
-          <w:numId w:val="1134"/>
+          <w:numId w:val="1136"/>
         </w:numPr>
       </w:pPr>
       <w:r>
@@ -10661,7 +10887,7 @@
         <w:pStyle w:val="Compact"/>
         <w:numPr>
           <w:ilvl w:val="0"/>
-          <w:numId w:val="1134"/>
+          <w:numId w:val="1136"/>
         </w:numPr>
       </w:pPr>
       <w:r>
@@ -10701,7 +10927,7 @@
         <w:pStyle w:val="Compact"/>
         <w:numPr>
           <w:ilvl w:val="0"/>
-          <w:numId w:val="1135"/>
+          <w:numId w:val="1137"/>
         </w:numPr>
       </w:pPr>
       <w:r>
@@ -10713,7 +10939,7 @@
         <w:pStyle w:val="Compact"/>
         <w:numPr>
           <w:ilvl w:val="0"/>
-          <w:numId w:val="1135"/>
+          <w:numId w:val="1137"/>
         </w:numPr>
       </w:pPr>
       <w:r>
@@ -10725,7 +10951,7 @@
         <w:pStyle w:val="Compact"/>
         <w:numPr>
           <w:ilvl w:val="0"/>
-          <w:numId w:val="1135"/>
+          <w:numId w:val="1137"/>
         </w:numPr>
       </w:pPr>
       <w:r>
@@ -10737,7 +10963,7 @@
         <w:pStyle w:val="Compact"/>
         <w:numPr>
           <w:ilvl w:val="0"/>
-          <w:numId w:val="1135"/>
+          <w:numId w:val="1137"/>
         </w:numPr>
       </w:pPr>
       <w:r>
@@ -10768,7 +10994,7 @@
         <w:pStyle w:val="Compact"/>
         <w:numPr>
           <w:ilvl w:val="0"/>
-          <w:numId w:val="1136"/>
+          <w:numId w:val="1138"/>
         </w:numPr>
       </w:pPr>
       <w:r>
@@ -10780,7 +11006,7 @@
         <w:pStyle w:val="Compact"/>
         <w:numPr>
           <w:ilvl w:val="0"/>
-          <w:numId w:val="1136"/>
+          <w:numId w:val="1138"/>
         </w:numPr>
       </w:pPr>
       <w:r>
@@ -10792,7 +11018,7 @@
         <w:pStyle w:val="Compact"/>
         <w:numPr>
           <w:ilvl w:val="0"/>
-          <w:numId w:val="1136"/>
+          <w:numId w:val="1138"/>
         </w:numPr>
       </w:pPr>
       <w:r>
@@ -10804,7 +11030,7 @@
         <w:pStyle w:val="Compact"/>
         <w:numPr>
           <w:ilvl w:val="0"/>
-          <w:numId w:val="1136"/>
+          <w:numId w:val="1138"/>
         </w:numPr>
       </w:pPr>
       <w:r>
@@ -10834,7 +11060,7 @@
         <w:pStyle w:val="Compact"/>
         <w:numPr>
           <w:ilvl w:val="0"/>
-          <w:numId w:val="1137"/>
+          <w:numId w:val="1139"/>
         </w:numPr>
       </w:pPr>
       <w:r>
@@ -10846,7 +11072,7 @@
         <w:pStyle w:val="Compact"/>
         <w:numPr>
           <w:ilvl w:val="0"/>
-          <w:numId w:val="1137"/>
+          <w:numId w:val="1139"/>
         </w:numPr>
       </w:pPr>
       <w:r>
@@ -10858,7 +11084,7 @@
         <w:pStyle w:val="Compact"/>
         <w:numPr>
           <w:ilvl w:val="0"/>
-          <w:numId w:val="1137"/>
+          <w:numId w:val="1139"/>
         </w:numPr>
       </w:pPr>
       <w:r>
@@ -10897,7 +11123,7 @@
         <w:pStyle w:val="Compact"/>
         <w:numPr>
           <w:ilvl w:val="0"/>
-          <w:numId w:val="1138"/>
+          <w:numId w:val="1140"/>
         </w:numPr>
       </w:pPr>
       <w:r>
@@ -10924,7 +11150,7 @@
         <w:pStyle w:val="Compact"/>
         <w:numPr>
           <w:ilvl w:val="0"/>
-          <w:numId w:val="1138"/>
+          <w:numId w:val="1140"/>
         </w:numPr>
       </w:pPr>
       <w:r>
@@ -10959,7 +11185,7 @@
         <w:pStyle w:val="Compact"/>
         <w:numPr>
           <w:ilvl w:val="0"/>
-          <w:numId w:val="1139"/>
+          <w:numId w:val="1141"/>
         </w:numPr>
       </w:pPr>
       <w:r>
@@ -11041,7 +11267,7 @@
         <w:pStyle w:val="Compact"/>
         <w:numPr>
           <w:ilvl w:val="0"/>
-          <w:numId w:val="1140"/>
+          <w:numId w:val="1142"/>
         </w:numPr>
       </w:pPr>
       <w:r>
@@ -11053,7 +11279,7 @@
         <w:pStyle w:val="Compact"/>
         <w:numPr>
           <w:ilvl w:val="0"/>
-          <w:numId w:val="1140"/>
+          <w:numId w:val="1142"/>
         </w:numPr>
       </w:pPr>
       <w:r>
@@ -11065,7 +11291,7 @@
         <w:pStyle w:val="Compact"/>
         <w:numPr>
           <w:ilvl w:val="0"/>
-          <w:numId w:val="1140"/>
+          <w:numId w:val="1142"/>
         </w:numPr>
       </w:pPr>
       <w:r>
@@ -11077,7 +11303,7 @@
         <w:pStyle w:val="Compact"/>
         <w:numPr>
           <w:ilvl w:val="0"/>
-          <w:numId w:val="1140"/>
+          <w:numId w:val="1142"/>
         </w:numPr>
       </w:pPr>
       <w:r>
@@ -11089,7 +11315,7 @@
         <w:pStyle w:val="Compact"/>
         <w:numPr>
           <w:ilvl w:val="0"/>
-          <w:numId w:val="1140"/>
+          <w:numId w:val="1142"/>
         </w:numPr>
       </w:pPr>
       <w:r>
@@ -11105,7 +11331,7 @@
     </w:p>
     <w:bookmarkEnd w:id="140"/>
     <w:bookmarkEnd w:id="141"/>
-    <w:bookmarkStart w:id="150" w:name="Xef91c134cefcf5f43d2ec741f6fcfac8e07d8a4"/>
+    <w:bookmarkStart w:id="151" w:name="Xef91c134cefcf5f43d2ec741f6fcfac8e07d8a4"/>
     <w:p>
       <w:pPr>
         <w:pStyle w:val="Heading1"/>
@@ -11151,7 +11377,7 @@
         <w:pStyle w:val="Compact"/>
         <w:numPr>
           <w:ilvl w:val="0"/>
-          <w:numId w:val="1141"/>
+          <w:numId w:val="1143"/>
         </w:numPr>
       </w:pPr>
       <w:r>
@@ -11176,7 +11402,7 @@
         <w:pStyle w:val="Compact"/>
         <w:numPr>
           <w:ilvl w:val="0"/>
-          <w:numId w:val="1142"/>
+          <w:numId w:val="1144"/>
         </w:numPr>
       </w:pPr>
       <w:r>
@@ -11191,7 +11417,7 @@
         <w:pStyle w:val="Compact"/>
         <w:numPr>
           <w:ilvl w:val="0"/>
-          <w:numId w:val="1142"/>
+          <w:numId w:val="1144"/>
         </w:numPr>
       </w:pPr>
       <w:r>
@@ -11206,7 +11432,7 @@
         <w:pStyle w:val="Compact"/>
         <w:numPr>
           <w:ilvl w:val="0"/>
-          <w:numId w:val="1142"/>
+          <w:numId w:val="1144"/>
         </w:numPr>
       </w:pPr>
       <w:r>
@@ -11221,7 +11447,7 @@
         <w:pStyle w:val="Compact"/>
         <w:numPr>
           <w:ilvl w:val="0"/>
-          <w:numId w:val="1142"/>
+          <w:numId w:val="1144"/>
         </w:numPr>
       </w:pPr>
       <w:r>
@@ -11236,7 +11462,7 @@
         <w:pStyle w:val="Compact"/>
         <w:numPr>
           <w:ilvl w:val="0"/>
-          <w:numId w:val="1142"/>
+          <w:numId w:val="1144"/>
         </w:numPr>
       </w:pPr>
       <w:r>
@@ -11251,7 +11477,7 @@
         <w:pStyle w:val="Compact"/>
         <w:numPr>
           <w:ilvl w:val="0"/>
-          <w:numId w:val="1142"/>
+          <w:numId w:val="1144"/>
         </w:numPr>
       </w:pPr>
       <w:r>
@@ -11266,7 +11492,7 @@
         <w:pStyle w:val="Compact"/>
         <w:numPr>
           <w:ilvl w:val="0"/>
-          <w:numId w:val="1142"/>
+          <w:numId w:val="1144"/>
         </w:numPr>
       </w:pPr>
       <w:r>
@@ -11281,7 +11507,7 @@
         <w:pStyle w:val="Compact"/>
         <w:numPr>
           <w:ilvl w:val="0"/>
-          <w:numId w:val="1142"/>
+          <w:numId w:val="1144"/>
         </w:numPr>
       </w:pPr>
       <w:r>
@@ -11296,7 +11522,7 @@
         <w:pStyle w:val="Compact"/>
         <w:numPr>
           <w:ilvl w:val="0"/>
-          <w:numId w:val="1142"/>
+          <w:numId w:val="1144"/>
         </w:numPr>
       </w:pPr>
       <w:r>
@@ -11311,7 +11537,7 @@
         <w:pStyle w:val="Compact"/>
         <w:numPr>
           <w:ilvl w:val="0"/>
-          <w:numId w:val="1142"/>
+          <w:numId w:val="1144"/>
         </w:numPr>
       </w:pPr>
       <w:r>
@@ -11326,7 +11552,7 @@
         <w:pStyle w:val="Compact"/>
         <w:numPr>
           <w:ilvl w:val="0"/>
-          <w:numId w:val="1142"/>
+          <w:numId w:val="1144"/>
         </w:numPr>
       </w:pPr>
       <w:r>
@@ -11341,7 +11567,7 @@
         <w:pStyle w:val="Compact"/>
         <w:numPr>
           <w:ilvl w:val="0"/>
-          <w:numId w:val="1142"/>
+          <w:numId w:val="1144"/>
         </w:numPr>
       </w:pPr>
       <w:r>
@@ -11356,7 +11582,7 @@
         <w:pStyle w:val="Compact"/>
         <w:numPr>
           <w:ilvl w:val="0"/>
-          <w:numId w:val="1142"/>
+          <w:numId w:val="1144"/>
         </w:numPr>
       </w:pPr>
       <w:r>
@@ -11371,7 +11597,7 @@
         <w:pStyle w:val="Compact"/>
         <w:numPr>
           <w:ilvl w:val="0"/>
-          <w:numId w:val="1142"/>
+          <w:numId w:val="1144"/>
         </w:numPr>
       </w:pPr>
       <w:r>
@@ -11386,7 +11612,7 @@
         <w:pStyle w:val="Compact"/>
         <w:numPr>
           <w:ilvl w:val="0"/>
-          <w:numId w:val="1142"/>
+          <w:numId w:val="1144"/>
         </w:numPr>
       </w:pPr>
       <w:r>
@@ -11401,7 +11627,7 @@
         <w:pStyle w:val="Compact"/>
         <w:numPr>
           <w:ilvl w:val="0"/>
-          <w:numId w:val="1142"/>
+          <w:numId w:val="1144"/>
         </w:numPr>
       </w:pPr>
       <w:r>
@@ -11431,7 +11657,7 @@
       <w:pPr>
         <w:numPr>
           <w:ilvl w:val="0"/>
-          <w:numId w:val="1143"/>
+          <w:numId w:val="1145"/>
         </w:numPr>
       </w:pPr>
       <w:r>
@@ -11445,7 +11671,7 @@
       <w:pPr>
         <w:numPr>
           <w:ilvl w:val="0"/>
-          <w:numId w:val="1143"/>
+          <w:numId w:val="1145"/>
         </w:numPr>
       </w:pPr>
       <w:r>
@@ -11459,7 +11685,7 @@
       <w:pPr>
         <w:numPr>
           <w:ilvl w:val="0"/>
-          <w:numId w:val="1143"/>
+          <w:numId w:val="1145"/>
         </w:numPr>
       </w:pPr>
       <w:r>
@@ -11473,7 +11699,7 @@
       <w:pPr>
         <w:numPr>
           <w:ilvl w:val="0"/>
-          <w:numId w:val="1143"/>
+          <w:numId w:val="1145"/>
         </w:numPr>
       </w:pPr>
       <w:r>
@@ -11487,7 +11713,7 @@
       <w:pPr>
         <w:numPr>
           <w:ilvl w:val="0"/>
-          <w:numId w:val="1143"/>
+          <w:numId w:val="1145"/>
         </w:numPr>
       </w:pPr>
       <w:r>
@@ -11501,7 +11727,7 @@
       <w:pPr>
         <w:numPr>
           <w:ilvl w:val="0"/>
-          <w:numId w:val="1143"/>
+          <w:numId w:val="1145"/>
         </w:numPr>
       </w:pPr>
       <w:r>
@@ -11515,7 +11741,7 @@
       <w:pPr>
         <w:numPr>
           <w:ilvl w:val="0"/>
-          <w:numId w:val="1143"/>
+          <w:numId w:val="1145"/>
         </w:numPr>
       </w:pPr>
       <w:r>
@@ -11529,7 +11755,7 @@
       <w:pPr>
         <w:numPr>
           <w:ilvl w:val="0"/>
-          <w:numId w:val="1143"/>
+          <w:numId w:val="1145"/>
         </w:numPr>
       </w:pPr>
       <w:r>
@@ -11543,7 +11769,7 @@
       <w:pPr>
         <w:numPr>
           <w:ilvl w:val="0"/>
-          <w:numId w:val="1143"/>
+          <w:numId w:val="1145"/>
         </w:numPr>
       </w:pPr>
       <w:r>
@@ -11557,7 +11783,7 @@
       <w:pPr>
         <w:numPr>
           <w:ilvl w:val="0"/>
-          <w:numId w:val="1143"/>
+          <w:numId w:val="1145"/>
         </w:numPr>
       </w:pPr>
       <w:r>
@@ -11571,7 +11797,7 @@
       <w:pPr>
         <w:numPr>
           <w:ilvl w:val="0"/>
-          <w:numId w:val="1143"/>
+          <w:numId w:val="1145"/>
         </w:numPr>
       </w:pPr>
       <w:r>
@@ -11585,7 +11811,7 @@
       <w:pPr>
         <w:numPr>
           <w:ilvl w:val="0"/>
-          <w:numId w:val="1143"/>
+          <w:numId w:val="1145"/>
         </w:numPr>
       </w:pPr>
       <w:r>
@@ -11599,7 +11825,7 @@
       <w:pPr>
         <w:numPr>
           <w:ilvl w:val="0"/>
-          <w:numId w:val="1143"/>
+          <w:numId w:val="1145"/>
         </w:numPr>
       </w:pPr>
       <w:r>
@@ -11613,7 +11839,7 @@
       <w:pPr>
         <w:numPr>
           <w:ilvl w:val="0"/>
-          <w:numId w:val="1143"/>
+          <w:numId w:val="1145"/>
         </w:numPr>
       </w:pPr>
       <w:r>
@@ -11627,7 +11853,7 @@
       <w:pPr>
         <w:numPr>
           <w:ilvl w:val="0"/>
-          <w:numId w:val="1143"/>
+          <w:numId w:val="1145"/>
         </w:numPr>
       </w:pPr>
       <w:r>
@@ -11641,7 +11867,7 @@
       <w:pPr>
         <w:numPr>
           <w:ilvl w:val="0"/>
-          <w:numId w:val="1143"/>
+          <w:numId w:val="1145"/>
         </w:numPr>
       </w:pPr>
       <w:r>
@@ -11655,7 +11881,7 @@
       <w:pPr>
         <w:numPr>
           <w:ilvl w:val="0"/>
-          <w:numId w:val="1143"/>
+          <w:numId w:val="1145"/>
         </w:numPr>
       </w:pPr>
       <w:r>
@@ -11669,7 +11895,7 @@
       <w:pPr>
         <w:numPr>
           <w:ilvl w:val="0"/>
-          <w:numId w:val="1143"/>
+          <w:numId w:val="1145"/>
         </w:numPr>
       </w:pPr>
       <w:r>
@@ -11683,7 +11909,7 @@
       <w:pPr>
         <w:numPr>
           <w:ilvl w:val="0"/>
-          <w:numId w:val="1143"/>
+          <w:numId w:val="1145"/>
         </w:numPr>
       </w:pPr>
       <w:r>
@@ -11697,7 +11923,7 @@
       <w:pPr>
         <w:numPr>
           <w:ilvl w:val="0"/>
-          <w:numId w:val="1143"/>
+          <w:numId w:val="1145"/>
         </w:numPr>
       </w:pPr>
       <w:r>
@@ -11711,7 +11937,7 @@
       <w:pPr>
         <w:numPr>
           <w:ilvl w:val="0"/>
-          <w:numId w:val="1143"/>
+          <w:numId w:val="1145"/>
         </w:numPr>
       </w:pPr>
       <w:r>
@@ -11736,7 +11962,7 @@
         <w:pStyle w:val="Compact"/>
         <w:numPr>
           <w:ilvl w:val="0"/>
-          <w:numId w:val="1144"/>
+          <w:numId w:val="1146"/>
         </w:numPr>
       </w:pPr>
       <w:r>
@@ -11751,7 +11977,7 @@
         <w:pStyle w:val="Compact"/>
         <w:numPr>
           <w:ilvl w:val="0"/>
-          <w:numId w:val="1144"/>
+          <w:numId w:val="1146"/>
         </w:numPr>
       </w:pPr>
       <w:r>
@@ -11766,7 +11992,7 @@
         <w:pStyle w:val="Compact"/>
         <w:numPr>
           <w:ilvl w:val="0"/>
-          <w:numId w:val="1144"/>
+          <w:numId w:val="1146"/>
         </w:numPr>
       </w:pPr>
       <w:r>
@@ -11781,7 +12007,7 @@
         <w:pStyle w:val="Compact"/>
         <w:numPr>
           <w:ilvl w:val="0"/>
-          <w:numId w:val="1144"/>
+          <w:numId w:val="1146"/>
         </w:numPr>
       </w:pPr>
       <w:r>
@@ -11796,7 +12022,7 @@
         <w:pStyle w:val="Compact"/>
         <w:numPr>
           <w:ilvl w:val="0"/>
-          <w:numId w:val="1144"/>
+          <w:numId w:val="1146"/>
         </w:numPr>
       </w:pPr>
       <w:r>
@@ -11811,7 +12037,7 @@
         <w:pStyle w:val="Compact"/>
         <w:numPr>
           <w:ilvl w:val="0"/>
-          <w:numId w:val="1144"/>
+          <w:numId w:val="1146"/>
         </w:numPr>
       </w:pPr>
       <w:r>
@@ -11826,7 +12052,7 @@
         <w:pStyle w:val="Compact"/>
         <w:numPr>
           <w:ilvl w:val="0"/>
-          <w:numId w:val="1144"/>
+          <w:numId w:val="1146"/>
         </w:numPr>
       </w:pPr>
       <w:r>
@@ -11859,7 +12085,7 @@
         <w:pStyle w:val="Compact"/>
         <w:numPr>
           <w:ilvl w:val="0"/>
-          <w:numId w:val="1145"/>
+          <w:numId w:val="1147"/>
         </w:numPr>
       </w:pPr>
       <w:r>
@@ -11874,7 +12100,7 @@
         <w:pStyle w:val="Compact"/>
         <w:numPr>
           <w:ilvl w:val="0"/>
-          <w:numId w:val="1145"/>
+          <w:numId w:val="1147"/>
         </w:numPr>
       </w:pPr>
       <w:r>
@@ -11889,7 +12115,7 @@
         <w:pStyle w:val="Compact"/>
         <w:numPr>
           <w:ilvl w:val="0"/>
-          <w:numId w:val="1145"/>
+          <w:numId w:val="1147"/>
         </w:numPr>
       </w:pPr>
       <w:r>
@@ -11904,7 +12130,7 @@
         <w:pStyle w:val="Compact"/>
         <w:numPr>
           <w:ilvl w:val="0"/>
-          <w:numId w:val="1145"/>
+          <w:numId w:val="1147"/>
         </w:numPr>
       </w:pPr>
       <w:r>
@@ -11919,7 +12145,7 @@
         <w:pStyle w:val="Compact"/>
         <w:numPr>
           <w:ilvl w:val="0"/>
-          <w:numId w:val="1145"/>
+          <w:numId w:val="1147"/>
         </w:numPr>
       </w:pPr>
       <w:r>
@@ -11934,7 +12160,7 @@
         <w:pStyle w:val="Compact"/>
         <w:numPr>
           <w:ilvl w:val="0"/>
-          <w:numId w:val="1145"/>
+          <w:numId w:val="1147"/>
         </w:numPr>
       </w:pPr>
       <w:r>
@@ -11949,7 +12175,7 @@
         <w:pStyle w:val="Compact"/>
         <w:numPr>
           <w:ilvl w:val="0"/>
-          <w:numId w:val="1145"/>
+          <w:numId w:val="1147"/>
         </w:numPr>
       </w:pPr>
       <w:r>
@@ -11964,7 +12190,7 @@
         <w:pStyle w:val="Compact"/>
         <w:numPr>
           <w:ilvl w:val="0"/>
-          <w:numId w:val="1145"/>
+          <w:numId w:val="1147"/>
         </w:numPr>
       </w:pPr>
       <w:r>
@@ -11979,7 +12205,7 @@
         <w:pStyle w:val="Compact"/>
         <w:numPr>
           <w:ilvl w:val="0"/>
-          <w:numId w:val="1145"/>
+          <w:numId w:val="1147"/>
         </w:numPr>
       </w:pPr>
       <w:r>
@@ -11994,7 +12220,7 @@
         <w:pStyle w:val="Compact"/>
         <w:numPr>
           <w:ilvl w:val="0"/>
-          <w:numId w:val="1145"/>
+          <w:numId w:val="1147"/>
         </w:numPr>
       </w:pPr>
       <w:r>
@@ -12009,7 +12235,7 @@
         <w:pStyle w:val="Compact"/>
         <w:numPr>
           <w:ilvl w:val="0"/>
-          <w:numId w:val="1145"/>
+          <w:numId w:val="1147"/>
         </w:numPr>
       </w:pPr>
       <w:r>
@@ -12024,7 +12250,7 @@
         <w:pStyle w:val="Compact"/>
         <w:numPr>
           <w:ilvl w:val="0"/>
-          <w:numId w:val="1145"/>
+          <w:numId w:val="1147"/>
         </w:numPr>
       </w:pPr>
       <w:r>
@@ -12039,7 +12265,7 @@
         <w:pStyle w:val="Compact"/>
         <w:numPr>
           <w:ilvl w:val="0"/>
-          <w:numId w:val="1145"/>
+          <w:numId w:val="1147"/>
         </w:numPr>
       </w:pPr>
       <w:r>
@@ -12054,7 +12280,7 @@
         <w:pStyle w:val="Compact"/>
         <w:numPr>
           <w:ilvl w:val="0"/>
-          <w:numId w:val="1145"/>
+          <w:numId w:val="1147"/>
         </w:numPr>
       </w:pPr>
       <w:r>
@@ -12069,7 +12295,7 @@
         <w:pStyle w:val="Compact"/>
         <w:numPr>
           <w:ilvl w:val="0"/>
-          <w:numId w:val="1145"/>
+          <w:numId w:val="1147"/>
         </w:numPr>
       </w:pPr>
       <w:r>
@@ -12084,7 +12310,7 @@
         <w:pStyle w:val="Compact"/>
         <w:numPr>
           <w:ilvl w:val="0"/>
-          <w:numId w:val="1145"/>
+          <w:numId w:val="1147"/>
         </w:numPr>
       </w:pPr>
       <w:r>
@@ -12099,7 +12325,7 @@
         <w:pStyle w:val="Compact"/>
         <w:numPr>
           <w:ilvl w:val="0"/>
-          <w:numId w:val="1145"/>
+          <w:numId w:val="1147"/>
         </w:numPr>
       </w:pPr>
       <w:r>
@@ -12114,7 +12340,7 @@
         <w:pStyle w:val="Compact"/>
         <w:numPr>
           <w:ilvl w:val="0"/>
-          <w:numId w:val="1145"/>
+          <w:numId w:val="1147"/>
         </w:numPr>
       </w:pPr>
       <w:r>
@@ -12129,7 +12355,7 @@
         <w:pStyle w:val="Compact"/>
         <w:numPr>
           <w:ilvl w:val="0"/>
-          <w:numId w:val="1145"/>
+          <w:numId w:val="1147"/>
         </w:numPr>
       </w:pPr>
       <w:r>
@@ -12144,7 +12370,7 @@
         <w:pStyle w:val="Compact"/>
         <w:numPr>
           <w:ilvl w:val="0"/>
-          <w:numId w:val="1145"/>
+          <w:numId w:val="1147"/>
         </w:numPr>
       </w:pPr>
       <w:r>
@@ -12167,7 +12393,7 @@
         <w:pStyle w:val="Compact"/>
         <w:numPr>
           <w:ilvl w:val="0"/>
-          <w:numId w:val="1146"/>
+          <w:numId w:val="1148"/>
         </w:numPr>
       </w:pPr>
       <w:r>
@@ -12182,7 +12408,7 @@
         <w:pStyle w:val="Compact"/>
         <w:numPr>
           <w:ilvl w:val="0"/>
-          <w:numId w:val="1146"/>
+          <w:numId w:val="1148"/>
         </w:numPr>
       </w:pPr>
       <w:r>
@@ -12197,7 +12423,7 @@
         <w:pStyle w:val="Compact"/>
         <w:numPr>
           <w:ilvl w:val="0"/>
-          <w:numId w:val="1146"/>
+          <w:numId w:val="1148"/>
         </w:numPr>
       </w:pPr>
       <w:r>
@@ -12212,7 +12438,7 @@
         <w:pStyle w:val="Compact"/>
         <w:numPr>
           <w:ilvl w:val="0"/>
-          <w:numId w:val="1146"/>
+          <w:numId w:val="1148"/>
         </w:numPr>
       </w:pPr>
       <w:r>
@@ -12227,7 +12453,7 @@
         <w:pStyle w:val="Compact"/>
         <w:numPr>
           <w:ilvl w:val="0"/>
-          <w:numId w:val="1146"/>
+          <w:numId w:val="1148"/>
         </w:numPr>
       </w:pPr>
       <w:r>
@@ -12242,7 +12468,7 @@
         <w:pStyle w:val="Compact"/>
         <w:numPr>
           <w:ilvl w:val="0"/>
-          <w:numId w:val="1146"/>
+          <w:numId w:val="1148"/>
         </w:numPr>
       </w:pPr>
       <w:r>
@@ -12257,7 +12483,7 @@
         <w:pStyle w:val="Compact"/>
         <w:numPr>
           <w:ilvl w:val="0"/>
-          <w:numId w:val="1146"/>
+          <w:numId w:val="1148"/>
         </w:numPr>
       </w:pPr>
       <w:r>
@@ -12272,7 +12498,7 @@
         <w:pStyle w:val="Compact"/>
         <w:numPr>
           <w:ilvl w:val="0"/>
-          <w:numId w:val="1146"/>
+          <w:numId w:val="1148"/>
         </w:numPr>
       </w:pPr>
       <w:r>
@@ -12287,7 +12513,7 @@
         <w:pStyle w:val="Compact"/>
         <w:numPr>
           <w:ilvl w:val="0"/>
-          <w:numId w:val="1146"/>
+          <w:numId w:val="1148"/>
         </w:numPr>
       </w:pPr>
       <w:r>
@@ -12302,7 +12528,7 @@
         <w:pStyle w:val="Compact"/>
         <w:numPr>
           <w:ilvl w:val="0"/>
-          <w:numId w:val="1146"/>
+          <w:numId w:val="1148"/>
         </w:numPr>
       </w:pPr>
       <w:r>
@@ -12317,7 +12543,7 @@
         <w:pStyle w:val="Compact"/>
         <w:numPr>
           <w:ilvl w:val="0"/>
-          <w:numId w:val="1146"/>
+          <w:numId w:val="1148"/>
         </w:numPr>
       </w:pPr>
       <w:r>
@@ -12332,7 +12558,7 @@
         <w:pStyle w:val="Compact"/>
         <w:numPr>
           <w:ilvl w:val="0"/>
-          <w:numId w:val="1146"/>
+          <w:numId w:val="1148"/>
         </w:numPr>
       </w:pPr>
       <w:r>
@@ -12347,7 +12573,7 @@
         <w:pStyle w:val="Compact"/>
         <w:numPr>
           <w:ilvl w:val="0"/>
-          <w:numId w:val="1146"/>
+          <w:numId w:val="1148"/>
         </w:numPr>
       </w:pPr>
       <w:r>
@@ -12362,7 +12588,7 @@
         <w:pStyle w:val="Compact"/>
         <w:numPr>
           <w:ilvl w:val="0"/>
-          <w:numId w:val="1146"/>
+          <w:numId w:val="1148"/>
         </w:numPr>
       </w:pPr>
       <w:r>
@@ -12377,7 +12603,7 @@
         <w:pStyle w:val="Compact"/>
         <w:numPr>
           <w:ilvl w:val="0"/>
-          <w:numId w:val="1146"/>
+          <w:numId w:val="1148"/>
         </w:numPr>
       </w:pPr>
       <w:r>
@@ -12392,7 +12618,7 @@
         <w:pStyle w:val="Compact"/>
         <w:numPr>
           <w:ilvl w:val="0"/>
-          <w:numId w:val="1146"/>
+          <w:numId w:val="1148"/>
         </w:numPr>
       </w:pPr>
       <w:r>
@@ -12416,7 +12642,7 @@
       <w:pPr>
         <w:numPr>
           <w:ilvl w:val="0"/>
-          <w:numId w:val="1147"/>
+          <w:numId w:val="1149"/>
         </w:numPr>
       </w:pPr>
       <w:r>
@@ -12430,7 +12656,7 @@
       <w:pPr>
         <w:numPr>
           <w:ilvl w:val="0"/>
-          <w:numId w:val="1147"/>
+          <w:numId w:val="1149"/>
         </w:numPr>
       </w:pPr>
       <w:r>
@@ -12444,7 +12670,7 @@
       <w:pPr>
         <w:numPr>
           <w:ilvl w:val="0"/>
-          <w:numId w:val="1147"/>
+          <w:numId w:val="1149"/>
         </w:numPr>
       </w:pPr>
       <w:r>
@@ -12458,7 +12684,7 @@
       <w:pPr>
         <w:numPr>
           <w:ilvl w:val="0"/>
-          <w:numId w:val="1147"/>
+          <w:numId w:val="1149"/>
         </w:numPr>
       </w:pPr>
       <w:r>
@@ -12472,7 +12698,7 @@
       <w:pPr>
         <w:numPr>
           <w:ilvl w:val="0"/>
-          <w:numId w:val="1147"/>
+          <w:numId w:val="1149"/>
         </w:numPr>
       </w:pPr>
       <w:r>
@@ -12486,7 +12712,7 @@
       <w:pPr>
         <w:numPr>
           <w:ilvl w:val="0"/>
-          <w:numId w:val="1147"/>
+          <w:numId w:val="1149"/>
         </w:numPr>
       </w:pPr>
       <w:r>
@@ -12500,7 +12726,7 @@
       <w:pPr>
         <w:numPr>
           <w:ilvl w:val="0"/>
-          <w:numId w:val="1147"/>
+          <w:numId w:val="1149"/>
         </w:numPr>
       </w:pPr>
       <w:r>
@@ -12514,7 +12740,7 @@
       <w:pPr>
         <w:numPr>
           <w:ilvl w:val="0"/>
-          <w:numId w:val="1147"/>
+          <w:numId w:val="1149"/>
         </w:numPr>
       </w:pPr>
       <w:r>
@@ -12528,7 +12754,7 @@
       <w:pPr>
         <w:numPr>
           <w:ilvl w:val="0"/>
-          <w:numId w:val="1147"/>
+          <w:numId w:val="1149"/>
         </w:numPr>
       </w:pPr>
       <w:r>
@@ -12542,7 +12768,7 @@
       <w:pPr>
         <w:numPr>
           <w:ilvl w:val="0"/>
-          <w:numId w:val="1147"/>
+          <w:numId w:val="1149"/>
         </w:numPr>
       </w:pPr>
       <w:r>
@@ -12556,7 +12782,7 @@
       <w:pPr>
         <w:numPr>
           <w:ilvl w:val="0"/>
-          <w:numId w:val="1147"/>
+          <w:numId w:val="1149"/>
         </w:numPr>
       </w:pPr>
       <w:r>
@@ -12570,7 +12796,7 @@
       <w:pPr>
         <w:numPr>
           <w:ilvl w:val="0"/>
-          <w:numId w:val="1147"/>
+          <w:numId w:val="1149"/>
         </w:numPr>
       </w:pPr>
       <w:r>
@@ -12584,7 +12810,7 @@
       <w:pPr>
         <w:numPr>
           <w:ilvl w:val="0"/>
-          <w:numId w:val="1147"/>
+          <w:numId w:val="1149"/>
         </w:numPr>
       </w:pPr>
       <w:r>
@@ -12598,7 +12824,7 @@
       <w:pPr>
         <w:numPr>
           <w:ilvl w:val="0"/>
-          <w:numId w:val="1147"/>
+          <w:numId w:val="1149"/>
         </w:numPr>
       </w:pPr>
       <w:r>
@@ -12612,7 +12838,7 @@
       <w:pPr>
         <w:numPr>
           <w:ilvl w:val="0"/>
-          <w:numId w:val="1147"/>
+          <w:numId w:val="1149"/>
         </w:numPr>
       </w:pPr>
       <w:r>
@@ -12645,7 +12871,7 @@
         <w:pStyle w:val="Compact"/>
         <w:numPr>
           <w:ilvl w:val="0"/>
-          <w:numId w:val="1148"/>
+          <w:numId w:val="1150"/>
         </w:numPr>
       </w:pPr>
       <w:r>
@@ -12660,7 +12886,7 @@
         <w:pStyle w:val="Compact"/>
         <w:numPr>
           <w:ilvl w:val="0"/>
-          <w:numId w:val="1148"/>
+          <w:numId w:val="1150"/>
         </w:numPr>
       </w:pPr>
       <w:r>
@@ -12675,7 +12901,7 @@
         <w:pStyle w:val="Compact"/>
         <w:numPr>
           <w:ilvl w:val="0"/>
-          <w:numId w:val="1148"/>
+          <w:numId w:val="1150"/>
         </w:numPr>
       </w:pPr>
       <w:r>
@@ -12690,7 +12916,7 @@
         <w:pStyle w:val="Compact"/>
         <w:numPr>
           <w:ilvl w:val="0"/>
-          <w:numId w:val="1148"/>
+          <w:numId w:val="1150"/>
         </w:numPr>
       </w:pPr>
       <w:r>
@@ -12705,7 +12931,22 @@
         <w:pStyle w:val="Compact"/>
         <w:numPr>
           <w:ilvl w:val="0"/>
-          <w:numId w:val="1148"/>
+          <w:numId w:val="1150"/>
+        </w:numPr>
+      </w:pPr>
+      <w:r>
+        <w:rPr>
+          <w:rStyle w:val="VerbatimChar"/>
+        </w:rPr>
+        <w:t xml:space="preserve">/api/notifications/{id}/restore/</w:t>
+      </w:r>
+    </w:p>
+    <w:p>
+      <w:pPr>
+        <w:pStyle w:val="Compact"/>
+        <w:numPr>
+          <w:ilvl w:val="0"/>
+          <w:numId w:val="1150"/>
         </w:numPr>
       </w:pPr>
       <w:r>
@@ -12720,7 +12961,7 @@
         <w:pStyle w:val="Compact"/>
         <w:numPr>
           <w:ilvl w:val="0"/>
-          <w:numId w:val="1148"/>
+          <w:numId w:val="1150"/>
         </w:numPr>
       </w:pPr>
       <w:r>
@@ -12735,7 +12976,7 @@
         <w:pStyle w:val="Compact"/>
         <w:numPr>
           <w:ilvl w:val="0"/>
-          <w:numId w:val="1148"/>
+          <w:numId w:val="1150"/>
         </w:numPr>
       </w:pPr>
       <w:r>
@@ -12758,7 +12999,7 @@
         <w:pStyle w:val="Compact"/>
         <w:numPr>
           <w:ilvl w:val="0"/>
-          <w:numId w:val="1149"/>
+          <w:numId w:val="1151"/>
         </w:numPr>
       </w:pPr>
       <w:r>
@@ -12773,7 +13014,7 @@
         <w:pStyle w:val="Compact"/>
         <w:numPr>
           <w:ilvl w:val="0"/>
-          <w:numId w:val="1149"/>
+          <w:numId w:val="1151"/>
         </w:numPr>
       </w:pPr>
       <w:r>
@@ -12788,7 +13029,7 @@
         <w:pStyle w:val="Compact"/>
         <w:numPr>
           <w:ilvl w:val="0"/>
-          <w:numId w:val="1149"/>
+          <w:numId w:val="1151"/>
         </w:numPr>
       </w:pPr>
       <w:r>
@@ -12803,7 +13044,22 @@
         <w:pStyle w:val="Compact"/>
         <w:numPr>
           <w:ilvl w:val="0"/>
-          <w:numId w:val="1149"/>
+          <w:numId w:val="1151"/>
+        </w:numPr>
+      </w:pPr>
+      <w:r>
+        <w:rPr>
+          <w:rStyle w:val="VerbatimChar"/>
+        </w:rPr>
+        <w:t xml:space="preserve">/api/audit/logs/by_user/</w:t>
+      </w:r>
+    </w:p>
+    <w:p>
+      <w:pPr>
+        <w:pStyle w:val="Compact"/>
+        <w:numPr>
+          <w:ilvl w:val="0"/>
+          <w:numId w:val="1151"/>
         </w:numPr>
       </w:pPr>
       <w:r>
@@ -12818,7 +13074,7 @@
         <w:pStyle w:val="Compact"/>
         <w:numPr>
           <w:ilvl w:val="0"/>
-          <w:numId w:val="1149"/>
+          <w:numId w:val="1151"/>
         </w:numPr>
       </w:pPr>
       <w:r>
@@ -12830,6 +13086,21 @@
     </w:p>
     <w:p>
       <w:pPr>
+        <w:pStyle w:val="Compact"/>
+        <w:numPr>
+          <w:ilvl w:val="0"/>
+          <w:numId w:val="1151"/>
+        </w:numPr>
+      </w:pPr>
+      <w:r>
+        <w:rPr>
+          <w:rStyle w:val="VerbatimChar"/>
+        </w:rPr>
+        <w:t xml:space="preserve">/api/audit/logs/event_catalog/</w:t>
+      </w:r>
+    </w:p>
+    <w:p>
+      <w:pPr>
         <w:pStyle w:val="FirstParagraph"/>
       </w:pPr>
       <w:r>
@@ -12841,7 +13112,7 @@
         <w:pStyle w:val="Compact"/>
         <w:numPr>
           <w:ilvl w:val="0"/>
-          <w:numId w:val="1150"/>
+          <w:numId w:val="1152"/>
         </w:numPr>
       </w:pPr>
       <w:r>
@@ -12856,7 +13127,7 @@
         <w:pStyle w:val="Compact"/>
         <w:numPr>
           <w:ilvl w:val="0"/>
-          <w:numId w:val="1150"/>
+          <w:numId w:val="1152"/>
         </w:numPr>
       </w:pPr>
       <w:r>
@@ -12871,7 +13142,7 @@
         <w:pStyle w:val="Compact"/>
         <w:numPr>
           <w:ilvl w:val="0"/>
-          <w:numId w:val="1150"/>
+          <w:numId w:val="1152"/>
         </w:numPr>
       </w:pPr>
       <w:r>
@@ -12886,7 +13157,7 @@
         <w:pStyle w:val="Compact"/>
         <w:numPr>
           <w:ilvl w:val="0"/>
-          <w:numId w:val="1150"/>
+          <w:numId w:val="1152"/>
         </w:numPr>
       </w:pPr>
       <w:r>
@@ -12901,7 +13172,7 @@
         <w:pStyle w:val="Compact"/>
         <w:numPr>
           <w:ilvl w:val="0"/>
-          <w:numId w:val="1150"/>
+          <w:numId w:val="1152"/>
         </w:numPr>
       </w:pPr>
       <w:r>
@@ -12916,7 +13187,7 @@
         <w:pStyle w:val="Compact"/>
         <w:numPr>
           <w:ilvl w:val="0"/>
-          <w:numId w:val="1150"/>
+          <w:numId w:val="1152"/>
         </w:numPr>
       </w:pPr>
       <w:r>
@@ -12931,7 +13202,7 @@
         <w:pStyle w:val="Compact"/>
         <w:numPr>
           <w:ilvl w:val="0"/>
-          <w:numId w:val="1150"/>
+          <w:numId w:val="1152"/>
         </w:numPr>
       </w:pPr>
       <w:r>
@@ -12946,7 +13217,7 @@
         <w:pStyle w:val="Compact"/>
         <w:numPr>
           <w:ilvl w:val="0"/>
-          <w:numId w:val="1150"/>
+          <w:numId w:val="1152"/>
         </w:numPr>
       </w:pPr>
       <w:r>
@@ -12961,7 +13232,7 @@
         <w:pStyle w:val="Compact"/>
         <w:numPr>
           <w:ilvl w:val="0"/>
-          <w:numId w:val="1150"/>
+          <w:numId w:val="1152"/>
         </w:numPr>
       </w:pPr>
       <w:r>
@@ -12976,7 +13247,7 @@
         <w:pStyle w:val="Compact"/>
         <w:numPr>
           <w:ilvl w:val="0"/>
-          <w:numId w:val="1150"/>
+          <w:numId w:val="1152"/>
         </w:numPr>
       </w:pPr>
       <w:r>
@@ -12999,7 +13270,7 @@
         <w:pStyle w:val="Compact"/>
         <w:numPr>
           <w:ilvl w:val="0"/>
-          <w:numId w:val="1151"/>
+          <w:numId w:val="1153"/>
         </w:numPr>
       </w:pPr>
       <w:r>
@@ -13014,7 +13285,7 @@
         <w:pStyle w:val="Compact"/>
         <w:numPr>
           <w:ilvl w:val="0"/>
-          <w:numId w:val="1151"/>
+          <w:numId w:val="1153"/>
         </w:numPr>
       </w:pPr>
       <w:r>
@@ -13029,7 +13300,7 @@
         <w:pStyle w:val="Compact"/>
         <w:numPr>
           <w:ilvl w:val="0"/>
-          <w:numId w:val="1151"/>
+          <w:numId w:val="1153"/>
         </w:numPr>
       </w:pPr>
       <w:r>
@@ -13044,7 +13315,7 @@
         <w:pStyle w:val="Compact"/>
         <w:numPr>
           <w:ilvl w:val="0"/>
-          <w:numId w:val="1151"/>
+          <w:numId w:val="1153"/>
         </w:numPr>
       </w:pPr>
       <w:r>
@@ -13059,7 +13330,7 @@
         <w:pStyle w:val="Compact"/>
         <w:numPr>
           <w:ilvl w:val="0"/>
-          <w:numId w:val="1151"/>
+          <w:numId w:val="1153"/>
         </w:numPr>
       </w:pPr>
       <w:r>
@@ -13074,7 +13345,7 @@
         <w:pStyle w:val="Compact"/>
         <w:numPr>
           <w:ilvl w:val="0"/>
-          <w:numId w:val="1151"/>
+          <w:numId w:val="1153"/>
         </w:numPr>
       </w:pPr>
       <w:r>
@@ -13103,7 +13374,7 @@
         <w:pStyle w:val="Compact"/>
         <w:numPr>
           <w:ilvl w:val="0"/>
-          <w:numId w:val="1152"/>
+          <w:numId w:val="1154"/>
         </w:numPr>
       </w:pPr>
       <w:r>
@@ -13118,7 +13389,7 @@
         <w:pStyle w:val="Compact"/>
         <w:numPr>
           <w:ilvl w:val="0"/>
-          <w:numId w:val="1152"/>
+          <w:numId w:val="1154"/>
         </w:numPr>
       </w:pPr>
       <w:r>
@@ -13133,7 +13404,7 @@
         <w:pStyle w:val="Compact"/>
         <w:numPr>
           <w:ilvl w:val="0"/>
-          <w:numId w:val="1152"/>
+          <w:numId w:val="1154"/>
         </w:numPr>
       </w:pPr>
       <w:r>
@@ -13166,7 +13437,7 @@
         <w:pStyle w:val="Compact"/>
         <w:numPr>
           <w:ilvl w:val="0"/>
-          <w:numId w:val="1153"/>
+          <w:numId w:val="1155"/>
         </w:numPr>
       </w:pPr>
       <w:r>
@@ -13181,7 +13452,7 @@
         <w:pStyle w:val="Compact"/>
         <w:numPr>
           <w:ilvl w:val="0"/>
-          <w:numId w:val="1153"/>
+          <w:numId w:val="1155"/>
         </w:numPr>
       </w:pPr>
       <w:r>
@@ -13196,7 +13467,7 @@
         <w:pStyle w:val="Compact"/>
         <w:numPr>
           <w:ilvl w:val="0"/>
-          <w:numId w:val="1153"/>
+          <w:numId w:val="1155"/>
         </w:numPr>
       </w:pPr>
       <w:r>
@@ -13211,7 +13482,7 @@
         <w:pStyle w:val="Compact"/>
         <w:numPr>
           <w:ilvl w:val="0"/>
-          <w:numId w:val="1153"/>
+          <w:numId w:val="1155"/>
         </w:numPr>
       </w:pPr>
       <w:r>
@@ -13226,7 +13497,7 @@
         <w:pStyle w:val="Compact"/>
         <w:numPr>
           <w:ilvl w:val="0"/>
-          <w:numId w:val="1153"/>
+          <w:numId w:val="1155"/>
         </w:numPr>
       </w:pPr>
       <w:r>
@@ -13241,7 +13512,7 @@
         <w:pStyle w:val="Compact"/>
         <w:numPr>
           <w:ilvl w:val="0"/>
-          <w:numId w:val="1153"/>
+          <w:numId w:val="1155"/>
         </w:numPr>
       </w:pPr>
       <w:r>
@@ -13256,7 +13527,7 @@
         <w:pStyle w:val="Compact"/>
         <w:numPr>
           <w:ilvl w:val="0"/>
-          <w:numId w:val="1153"/>
+          <w:numId w:val="1155"/>
         </w:numPr>
       </w:pPr>
       <w:r>
@@ -13271,7 +13542,7 @@
         <w:pStyle w:val="Compact"/>
         <w:numPr>
           <w:ilvl w:val="0"/>
-          <w:numId w:val="1153"/>
+          <w:numId w:val="1155"/>
         </w:numPr>
       </w:pPr>
       <w:r>
@@ -13286,7 +13557,7 @@
         <w:pStyle w:val="Compact"/>
         <w:numPr>
           <w:ilvl w:val="0"/>
-          <w:numId w:val="1153"/>
+          <w:numId w:val="1155"/>
         </w:numPr>
       </w:pPr>
       <w:r>
@@ -13301,7 +13572,7 @@
         <w:pStyle w:val="Compact"/>
         <w:numPr>
           <w:ilvl w:val="0"/>
-          <w:numId w:val="1153"/>
+          <w:numId w:val="1155"/>
         </w:numPr>
       </w:pPr>
       <w:r>
@@ -13316,7 +13587,7 @@
         <w:pStyle w:val="Compact"/>
         <w:numPr>
           <w:ilvl w:val="0"/>
-          <w:numId w:val="1153"/>
+          <w:numId w:val="1155"/>
         </w:numPr>
       </w:pPr>
       <w:r>
@@ -13331,7 +13602,7 @@
         <w:pStyle w:val="Compact"/>
         <w:numPr>
           <w:ilvl w:val="0"/>
-          <w:numId w:val="1153"/>
+          <w:numId w:val="1155"/>
         </w:numPr>
       </w:pPr>
       <w:r>
@@ -13346,7 +13617,7 @@
         <w:pStyle w:val="Compact"/>
         <w:numPr>
           <w:ilvl w:val="0"/>
-          <w:numId w:val="1153"/>
+          <w:numId w:val="1155"/>
         </w:numPr>
       </w:pPr>
       <w:r>
@@ -13361,7 +13632,7 @@
         <w:pStyle w:val="Compact"/>
         <w:numPr>
           <w:ilvl w:val="0"/>
-          <w:numId w:val="1153"/>
+          <w:numId w:val="1155"/>
         </w:numPr>
       </w:pPr>
       <w:r>
@@ -13384,7 +13655,7 @@
         <w:pStyle w:val="Compact"/>
         <w:numPr>
           <w:ilvl w:val="0"/>
-          <w:numId w:val="1154"/>
+          <w:numId w:val="1156"/>
         </w:numPr>
       </w:pPr>
       <w:r>
@@ -13399,7 +13670,7 @@
         <w:pStyle w:val="Compact"/>
         <w:numPr>
           <w:ilvl w:val="0"/>
-          <w:numId w:val="1154"/>
+          <w:numId w:val="1156"/>
         </w:numPr>
       </w:pPr>
       <w:r>
@@ -13414,7 +13685,7 @@
         <w:pStyle w:val="Compact"/>
         <w:numPr>
           <w:ilvl w:val="0"/>
-          <w:numId w:val="1154"/>
+          <w:numId w:val="1156"/>
         </w:numPr>
       </w:pPr>
       <w:r>
@@ -13429,7 +13700,7 @@
         <w:pStyle w:val="Compact"/>
         <w:numPr>
           <w:ilvl w:val="0"/>
-          <w:numId w:val="1154"/>
+          <w:numId w:val="1156"/>
         </w:numPr>
       </w:pPr>
       <w:r>
@@ -13444,7 +13715,7 @@
         <w:pStyle w:val="Compact"/>
         <w:numPr>
           <w:ilvl w:val="0"/>
-          <w:numId w:val="1154"/>
+          <w:numId w:val="1156"/>
         </w:numPr>
       </w:pPr>
       <w:r>
@@ -13452,6 +13723,446 @@
           <w:rStyle w:val="VerbatimChar"/>
         </w:rPr>
         <w:t xml:space="preserve">/api/background-checks/providers/{provider_key}/webhook/</w:t>
+      </w:r>
+    </w:p>
+    <w:bookmarkEnd w:id="149"/>
+    <w:bookmarkStart w:id="150" w:name="X4ed635dc53c441a5746782d060a105a2abcdaf3"/>
+    <w:p>
+      <w:pPr>
+        <w:pStyle w:val="Heading2"/>
+      </w:pPr>
+      <w:r>
+        <w:t xml:space="preserve">15.9 Government Appointments (GAMS)</w:t>
+      </w:r>
+    </w:p>
+    <w:p>
+      <w:pPr>
+        <w:pStyle w:val="FirstParagraph"/>
+      </w:pPr>
+      <w:r>
+        <w:t xml:space="preserve">Positions:</w:t>
+      </w:r>
+    </w:p>
+    <w:p>
+      <w:pPr>
+        <w:pStyle w:val="Compact"/>
+        <w:numPr>
+          <w:ilvl w:val="0"/>
+          <w:numId w:val="1157"/>
+        </w:numPr>
+      </w:pPr>
+      <w:r>
+        <w:rPr>
+          <w:rStyle w:val="VerbatimChar"/>
+        </w:rPr>
+        <w:t xml:space="preserve">/api/positions/</w:t>
+      </w:r>
+    </w:p>
+    <w:p>
+      <w:pPr>
+        <w:pStyle w:val="Compact"/>
+        <w:numPr>
+          <w:ilvl w:val="0"/>
+          <w:numId w:val="1157"/>
+        </w:numPr>
+      </w:pPr>
+      <w:r>
+        <w:rPr>
+          <w:rStyle w:val="VerbatimChar"/>
+        </w:rPr>
+        <w:t xml:space="preserve">/api/positions/{id}/</w:t>
+      </w:r>
+    </w:p>
+    <w:p>
+      <w:pPr>
+        <w:pStyle w:val="Compact"/>
+        <w:numPr>
+          <w:ilvl w:val="0"/>
+          <w:numId w:val="1157"/>
+        </w:numPr>
+      </w:pPr>
+      <w:r>
+        <w:rPr>
+          <w:rStyle w:val="VerbatimChar"/>
+        </w:rPr>
+        <w:t xml:space="preserve">/api/positions/public/</w:t>
+      </w:r>
+    </w:p>
+    <w:p>
+      <w:pPr>
+        <w:pStyle w:val="Compact"/>
+        <w:numPr>
+          <w:ilvl w:val="0"/>
+          <w:numId w:val="1157"/>
+        </w:numPr>
+      </w:pPr>
+      <w:r>
+        <w:rPr>
+          <w:rStyle w:val="VerbatimChar"/>
+        </w:rPr>
+        <w:t xml:space="preserve">/api/positions/vacant/</w:t>
+      </w:r>
+    </w:p>
+    <w:p>
+      <w:pPr>
+        <w:pStyle w:val="Compact"/>
+        <w:numPr>
+          <w:ilvl w:val="0"/>
+          <w:numId w:val="1157"/>
+        </w:numPr>
+      </w:pPr>
+      <w:r>
+        <w:rPr>
+          <w:rStyle w:val="VerbatimChar"/>
+        </w:rPr>
+        <w:t xml:space="preserve">/api/positions/{id}/appointment-history/</w:t>
+      </w:r>
+    </w:p>
+    <w:p>
+      <w:pPr>
+        <w:pStyle w:val="FirstParagraph"/>
+      </w:pPr>
+      <w:r>
+        <w:t xml:space="preserve">Personnel:</w:t>
+      </w:r>
+    </w:p>
+    <w:p>
+      <w:pPr>
+        <w:pStyle w:val="Compact"/>
+        <w:numPr>
+          <w:ilvl w:val="0"/>
+          <w:numId w:val="1158"/>
+        </w:numPr>
+      </w:pPr>
+      <w:r>
+        <w:rPr>
+          <w:rStyle w:val="VerbatimChar"/>
+        </w:rPr>
+        <w:t xml:space="preserve">/api/personnel/</w:t>
+      </w:r>
+    </w:p>
+    <w:p>
+      <w:pPr>
+        <w:pStyle w:val="Compact"/>
+        <w:numPr>
+          <w:ilvl w:val="0"/>
+          <w:numId w:val="1158"/>
+        </w:numPr>
+      </w:pPr>
+      <w:r>
+        <w:rPr>
+          <w:rStyle w:val="VerbatimChar"/>
+        </w:rPr>
+        <w:t xml:space="preserve">/api/personnel/{id}/</w:t>
+      </w:r>
+    </w:p>
+    <w:p>
+      <w:pPr>
+        <w:pStyle w:val="Compact"/>
+        <w:numPr>
+          <w:ilvl w:val="0"/>
+          <w:numId w:val="1158"/>
+        </w:numPr>
+      </w:pPr>
+      <w:r>
+        <w:rPr>
+          <w:rStyle w:val="VerbatimChar"/>
+        </w:rPr>
+        <w:t xml:space="preserve">/api/personnel/officeholders/</w:t>
+      </w:r>
+    </w:p>
+    <w:p>
+      <w:pPr>
+        <w:pStyle w:val="Compact"/>
+        <w:numPr>
+          <w:ilvl w:val="0"/>
+          <w:numId w:val="1158"/>
+        </w:numPr>
+      </w:pPr>
+      <w:r>
+        <w:rPr>
+          <w:rStyle w:val="VerbatimChar"/>
+        </w:rPr>
+        <w:t xml:space="preserve">/api/personnel/{id}/link-candidate/</w:t>
+      </w:r>
+    </w:p>
+    <w:p>
+      <w:pPr>
+        <w:pStyle w:val="Compact"/>
+        <w:numPr>
+          <w:ilvl w:val="0"/>
+          <w:numId w:val="1158"/>
+        </w:numPr>
+      </w:pPr>
+      <w:r>
+        <w:rPr>
+          <w:rStyle w:val="VerbatimChar"/>
+        </w:rPr>
+        <w:t xml:space="preserve">/api/personnel/{id}/appointment-history/</w:t>
+      </w:r>
+    </w:p>
+    <w:p>
+      <w:pPr>
+        <w:pStyle w:val="FirstParagraph"/>
+      </w:pPr>
+      <w:r>
+        <w:t xml:space="preserve">Approval chain:</w:t>
+      </w:r>
+    </w:p>
+    <w:p>
+      <w:pPr>
+        <w:pStyle w:val="Compact"/>
+        <w:numPr>
+          <w:ilvl w:val="0"/>
+          <w:numId w:val="1159"/>
+        </w:numPr>
+      </w:pPr>
+      <w:r>
+        <w:rPr>
+          <w:rStyle w:val="VerbatimChar"/>
+        </w:rPr>
+        <w:t xml:space="preserve">/api/appointments/stage-templates/</w:t>
+      </w:r>
+    </w:p>
+    <w:p>
+      <w:pPr>
+        <w:pStyle w:val="Compact"/>
+        <w:numPr>
+          <w:ilvl w:val="0"/>
+          <w:numId w:val="1159"/>
+        </w:numPr>
+      </w:pPr>
+      <w:r>
+        <w:rPr>
+          <w:rStyle w:val="VerbatimChar"/>
+        </w:rPr>
+        <w:t xml:space="preserve">/api/appointments/stage-templates/{id}/</w:t>
+      </w:r>
+    </w:p>
+    <w:p>
+      <w:pPr>
+        <w:pStyle w:val="Compact"/>
+        <w:numPr>
+          <w:ilvl w:val="0"/>
+          <w:numId w:val="1159"/>
+        </w:numPr>
+      </w:pPr>
+      <w:r>
+        <w:rPr>
+          <w:rStyle w:val="VerbatimChar"/>
+        </w:rPr>
+        <w:t xml:space="preserve">/api/appointments/stages/</w:t>
+      </w:r>
+    </w:p>
+    <w:p>
+      <w:pPr>
+        <w:pStyle w:val="Compact"/>
+        <w:numPr>
+          <w:ilvl w:val="0"/>
+          <w:numId w:val="1159"/>
+        </w:numPr>
+      </w:pPr>
+      <w:r>
+        <w:rPr>
+          <w:rStyle w:val="VerbatimChar"/>
+        </w:rPr>
+        <w:t xml:space="preserve">/api/appointments/stages/{id}/</w:t>
+      </w:r>
+    </w:p>
+    <w:p>
+      <w:pPr>
+        <w:pStyle w:val="FirstParagraph"/>
+      </w:pPr>
+      <w:r>
+        <w:t xml:space="preserve">Appointment lifecycle:</w:t>
+      </w:r>
+    </w:p>
+    <w:p>
+      <w:pPr>
+        <w:pStyle w:val="Compact"/>
+        <w:numPr>
+          <w:ilvl w:val="0"/>
+          <w:numId w:val="1160"/>
+        </w:numPr>
+      </w:pPr>
+      <w:r>
+        <w:rPr>
+          <w:rStyle w:val="VerbatimChar"/>
+        </w:rPr>
+        <w:t xml:space="preserve">/api/appointments/records/</w:t>
+      </w:r>
+    </w:p>
+    <w:p>
+      <w:pPr>
+        <w:pStyle w:val="Compact"/>
+        <w:numPr>
+          <w:ilvl w:val="0"/>
+          <w:numId w:val="1160"/>
+        </w:numPr>
+      </w:pPr>
+      <w:r>
+        <w:rPr>
+          <w:rStyle w:val="VerbatimChar"/>
+        </w:rPr>
+        <w:t xml:space="preserve">/api/appointments/records/{id}/</w:t>
+      </w:r>
+    </w:p>
+    <w:p>
+      <w:pPr>
+        <w:pStyle w:val="Compact"/>
+        <w:numPr>
+          <w:ilvl w:val="0"/>
+          <w:numId w:val="1160"/>
+        </w:numPr>
+      </w:pPr>
+      <w:r>
+        <w:rPr>
+          <w:rStyle w:val="VerbatimChar"/>
+        </w:rPr>
+        <w:t xml:space="preserve">/api/appointments/records/{id}/ensure-vetting-linkage/</w:t>
+      </w:r>
+    </w:p>
+    <w:p>
+      <w:pPr>
+        <w:pStyle w:val="Compact"/>
+        <w:numPr>
+          <w:ilvl w:val="0"/>
+          <w:numId w:val="1160"/>
+        </w:numPr>
+      </w:pPr>
+      <w:r>
+        <w:rPr>
+          <w:rStyle w:val="VerbatimChar"/>
+        </w:rPr>
+        <w:t xml:space="preserve">/api/appointments/records/{id}/advance-stage/</w:t>
+      </w:r>
+    </w:p>
+    <w:p>
+      <w:pPr>
+        <w:pStyle w:val="Compact"/>
+        <w:numPr>
+          <w:ilvl w:val="0"/>
+          <w:numId w:val="1160"/>
+        </w:numPr>
+      </w:pPr>
+      <w:r>
+        <w:rPr>
+          <w:rStyle w:val="VerbatimChar"/>
+        </w:rPr>
+        <w:t xml:space="preserve">/api/appointments/records/{id}/appoint/</w:t>
+      </w:r>
+    </w:p>
+    <w:p>
+      <w:pPr>
+        <w:pStyle w:val="Compact"/>
+        <w:numPr>
+          <w:ilvl w:val="0"/>
+          <w:numId w:val="1160"/>
+        </w:numPr>
+      </w:pPr>
+      <w:r>
+        <w:rPr>
+          <w:rStyle w:val="VerbatimChar"/>
+        </w:rPr>
+        <w:t xml:space="preserve">/api/appointments/records/{id}/reject/</w:t>
+      </w:r>
+    </w:p>
+    <w:p>
+      <w:pPr>
+        <w:pStyle w:val="Compact"/>
+        <w:numPr>
+          <w:ilvl w:val="0"/>
+          <w:numId w:val="1160"/>
+        </w:numPr>
+      </w:pPr>
+      <w:r>
+        <w:rPr>
+          <w:rStyle w:val="VerbatimChar"/>
+        </w:rPr>
+        <w:t xml:space="preserve">/api/appointments/records/{id}/stage-actions/</w:t>
+      </w:r>
+    </w:p>
+    <w:p>
+      <w:pPr>
+        <w:pStyle w:val="Compact"/>
+        <w:numPr>
+          <w:ilvl w:val="0"/>
+          <w:numId w:val="1160"/>
+        </w:numPr>
+      </w:pPr>
+      <w:r>
+        <w:rPr>
+          <w:rStyle w:val="VerbatimChar"/>
+        </w:rPr>
+        <w:t xml:space="preserve">/api/appointments/records/{id}/publication/</w:t>
+      </w:r>
+    </w:p>
+    <w:p>
+      <w:pPr>
+        <w:pStyle w:val="Compact"/>
+        <w:numPr>
+          <w:ilvl w:val="0"/>
+          <w:numId w:val="1160"/>
+        </w:numPr>
+      </w:pPr>
+      <w:r>
+        <w:rPr>
+          <w:rStyle w:val="VerbatimChar"/>
+        </w:rPr>
+        <w:t xml:space="preserve">/api/appointments/records/{id}/publish/</w:t>
+      </w:r>
+    </w:p>
+    <w:p>
+      <w:pPr>
+        <w:pStyle w:val="Compact"/>
+        <w:numPr>
+          <w:ilvl w:val="0"/>
+          <w:numId w:val="1160"/>
+        </w:numPr>
+      </w:pPr>
+      <w:r>
+        <w:rPr>
+          <w:rStyle w:val="VerbatimChar"/>
+        </w:rPr>
+        <w:t xml:space="preserve">/api/appointments/records/{id}/revoke-publication/</w:t>
+      </w:r>
+    </w:p>
+    <w:p>
+      <w:pPr>
+        <w:pStyle w:val="FirstParagraph"/>
+      </w:pPr>
+      <w:r>
+        <w:t xml:space="preserve">Public feeds:</w:t>
+      </w:r>
+    </w:p>
+    <w:p>
+      <w:pPr>
+        <w:pStyle w:val="Compact"/>
+        <w:numPr>
+          <w:ilvl w:val="0"/>
+          <w:numId w:val="1161"/>
+        </w:numPr>
+      </w:pPr>
+      <w:r>
+        <w:rPr>
+          <w:rStyle w:val="VerbatimChar"/>
+        </w:rPr>
+        <w:t xml:space="preserve">/api/appointments/records/gazette-feed/</w:t>
+      </w:r>
+    </w:p>
+    <w:p>
+      <w:pPr>
+        <w:pStyle w:val="Compact"/>
+        <w:numPr>
+          <w:ilvl w:val="0"/>
+          <w:numId w:val="1161"/>
+        </w:numPr>
+      </w:pPr>
+      <w:r>
+        <w:rPr>
+          <w:rStyle w:val="VerbatimChar"/>
+        </w:rPr>
+        <w:t xml:space="preserve">/api/appointments/records/open/</w:t>
       </w:r>
     </w:p>
     <w:p>
@@ -13461,9 +14172,9 @@
         </w:pict>
       </w:r>
     </w:p>
-    <w:bookmarkEnd w:id="149"/>
     <w:bookmarkEnd w:id="150"/>
-    <w:bookmarkStart w:id="160" w:name="X991313a2981ee52c6c730eebca9af2a9294bb3c"/>
+    <w:bookmarkEnd w:id="151"/>
+    <w:bookmarkStart w:id="161" w:name="X991313a2981ee52c6c730eebca9af2a9294bb3c"/>
     <w:p>
       <w:pPr>
         <w:pStyle w:val="Heading1"/>
@@ -13472,7 +14183,7 @@
         <w:t xml:space="preserve">16) Glossary and Best Practices</w:t>
       </w:r>
     </w:p>
-    <w:bookmarkStart w:id="151" w:name="Xb05d7b1d19a5f86ab5757c1dd3f8121c9ad07c3"/>
+    <w:bookmarkStart w:id="152" w:name="Xb05d7b1d19a5f86ab5757c1dd3f8121c9ad07c3"/>
     <w:p>
       <w:pPr>
         <w:pStyle w:val="Heading2"/>
@@ -13486,7 +14197,7 @@
         <w:pStyle w:val="Compact"/>
         <w:numPr>
           <w:ilvl w:val="0"/>
-          <w:numId w:val="1155"/>
+          <w:numId w:val="1162"/>
         </w:numPr>
       </w:pPr>
       <w:r>
@@ -13498,7 +14209,7 @@
         <w:pStyle w:val="Compact"/>
         <w:numPr>
           <w:ilvl w:val="0"/>
-          <w:numId w:val="1155"/>
+          <w:numId w:val="1162"/>
         </w:numPr>
       </w:pPr>
       <w:r>
@@ -13510,7 +14221,7 @@
         <w:pStyle w:val="Compact"/>
         <w:numPr>
           <w:ilvl w:val="0"/>
-          <w:numId w:val="1155"/>
+          <w:numId w:val="1162"/>
         </w:numPr>
       </w:pPr>
       <w:r>
@@ -13522,7 +14233,7 @@
         <w:pStyle w:val="Compact"/>
         <w:numPr>
           <w:ilvl w:val="0"/>
-          <w:numId w:val="1155"/>
+          <w:numId w:val="1162"/>
         </w:numPr>
       </w:pPr>
       <w:r>
@@ -13534,7 +14245,7 @@
         <w:pStyle w:val="Compact"/>
         <w:numPr>
           <w:ilvl w:val="0"/>
-          <w:numId w:val="1155"/>
+          <w:numId w:val="1162"/>
         </w:numPr>
       </w:pPr>
       <w:r>
@@ -13546,7 +14257,7 @@
         <w:pStyle w:val="Compact"/>
         <w:numPr>
           <w:ilvl w:val="0"/>
-          <w:numId w:val="1155"/>
+          <w:numId w:val="1162"/>
         </w:numPr>
       </w:pPr>
       <w:r>
@@ -13558,7 +14269,7 @@
         <w:pStyle w:val="Compact"/>
         <w:numPr>
           <w:ilvl w:val="0"/>
-          <w:numId w:val="1155"/>
+          <w:numId w:val="1162"/>
         </w:numPr>
       </w:pPr>
       <w:r>
@@ -13570,7 +14281,7 @@
         <w:pStyle w:val="Compact"/>
         <w:numPr>
           <w:ilvl w:val="0"/>
-          <w:numId w:val="1155"/>
+          <w:numId w:val="1162"/>
         </w:numPr>
       </w:pPr>
       <w:r>
@@ -13582,7 +14293,7 @@
         <w:pStyle w:val="Compact"/>
         <w:numPr>
           <w:ilvl w:val="0"/>
-          <w:numId w:val="1155"/>
+          <w:numId w:val="1162"/>
         </w:numPr>
       </w:pPr>
       <w:r>
@@ -13594,7 +14305,7 @@
         <w:pStyle w:val="Compact"/>
         <w:numPr>
           <w:ilvl w:val="0"/>
-          <w:numId w:val="1155"/>
+          <w:numId w:val="1162"/>
         </w:numPr>
       </w:pPr>
       <w:r>
@@ -13606,15 +14317,15 @@
         <w:pStyle w:val="Compact"/>
         <w:numPr>
           <w:ilvl w:val="0"/>
-          <w:numId w:val="1155"/>
+          <w:numId w:val="1162"/>
         </w:numPr>
       </w:pPr>
       <w:r>
         <w:t xml:space="preserve">Reconciliation: Explicit status refresh/confirm call to recover missed callback events.</w:t>
       </w:r>
     </w:p>
-    <w:bookmarkEnd w:id="151"/>
-    <w:bookmarkStart w:id="155" w:name="X1e4cb1ad29893bdb2acf176c297dfb070f334eb"/>
+    <w:bookmarkEnd w:id="152"/>
+    <w:bookmarkStart w:id="156" w:name="X1e4cb1ad29893bdb2acf176c297dfb070f334eb"/>
     <w:p>
       <w:pPr>
         <w:pStyle w:val="Heading2"/>
@@ -13623,7 +14334,7 @@
         <w:t xml:space="preserve">16.2 User Best Practices</w:t>
       </w:r>
     </w:p>
-    <w:bookmarkStart w:id="152" w:name="for-hr-managers"/>
+    <w:bookmarkStart w:id="153" w:name="for-hr-managers"/>
     <w:p>
       <w:pPr>
         <w:pStyle w:val="Heading3"/>
@@ -13637,7 +14348,7 @@
         <w:pStyle w:val="Compact"/>
         <w:numPr>
           <w:ilvl w:val="0"/>
-          <w:numId w:val="1156"/>
+          <w:numId w:val="1163"/>
         </w:numPr>
       </w:pPr>
       <w:r>
@@ -13649,7 +14360,7 @@
         <w:pStyle w:val="Compact"/>
         <w:numPr>
           <w:ilvl w:val="0"/>
-          <w:numId w:val="1156"/>
+          <w:numId w:val="1163"/>
         </w:numPr>
       </w:pPr>
       <w:r>
@@ -13661,7 +14372,7 @@
         <w:pStyle w:val="Compact"/>
         <w:numPr>
           <w:ilvl w:val="0"/>
-          <w:numId w:val="1156"/>
+          <w:numId w:val="1163"/>
         </w:numPr>
       </w:pPr>
       <w:r>
@@ -13673,15 +14384,15 @@
         <w:pStyle w:val="Compact"/>
         <w:numPr>
           <w:ilvl w:val="0"/>
-          <w:numId w:val="1156"/>
+          <w:numId w:val="1163"/>
         </w:numPr>
       </w:pPr>
       <w:r>
         <w:t xml:space="preserve">Keep campaign notes and decision rationale consistent.</w:t>
       </w:r>
     </w:p>
-    <w:bookmarkEnd w:id="152"/>
-    <w:bookmarkStart w:id="153" w:name="for-admins"/>
+    <w:bookmarkEnd w:id="153"/>
+    <w:bookmarkStart w:id="154" w:name="for-admins"/>
     <w:p>
       <w:pPr>
         <w:pStyle w:val="Heading3"/>
@@ -13695,7 +14406,7 @@
         <w:pStyle w:val="Compact"/>
         <w:numPr>
           <w:ilvl w:val="0"/>
-          <w:numId w:val="1157"/>
+          <w:numId w:val="1164"/>
         </w:numPr>
       </w:pPr>
       <w:r>
@@ -13707,7 +14418,7 @@
         <w:pStyle w:val="Compact"/>
         <w:numPr>
           <w:ilvl w:val="0"/>
-          <w:numId w:val="1157"/>
+          <w:numId w:val="1164"/>
         </w:numPr>
       </w:pPr>
       <w:r>
@@ -13719,7 +14430,7 @@
         <w:pStyle w:val="Compact"/>
         <w:numPr>
           <w:ilvl w:val="0"/>
-          <w:numId w:val="1157"/>
+          <w:numId w:val="1164"/>
         </w:numPr>
       </w:pPr>
       <w:r>
@@ -13731,15 +14442,15 @@
         <w:pStyle w:val="Compact"/>
         <w:numPr>
           <w:ilvl w:val="0"/>
-          <w:numId w:val="1157"/>
+          <w:numId w:val="1164"/>
         </w:numPr>
       </w:pPr>
       <w:r>
         <w:t xml:space="preserve">Separate policy controls from day-to-day vetting execution.</w:t>
       </w:r>
     </w:p>
-    <w:bookmarkEnd w:id="153"/>
-    <w:bookmarkStart w:id="154" w:name="for-candidates"/>
+    <w:bookmarkEnd w:id="154"/>
+    <w:bookmarkStart w:id="155" w:name="for-candidates"/>
     <w:p>
       <w:pPr>
         <w:pStyle w:val="Heading3"/>
@@ -13753,7 +14464,7 @@
         <w:pStyle w:val="Compact"/>
         <w:numPr>
           <w:ilvl w:val="0"/>
-          <w:numId w:val="1158"/>
+          <w:numId w:val="1165"/>
         </w:numPr>
       </w:pPr>
       <w:r>
@@ -13765,7 +14476,7 @@
         <w:pStyle w:val="Compact"/>
         <w:numPr>
           <w:ilvl w:val="0"/>
-          <w:numId w:val="1158"/>
+          <w:numId w:val="1165"/>
         </w:numPr>
       </w:pPr>
       <w:r>
@@ -13777,7 +14488,7 @@
         <w:pStyle w:val="Compact"/>
         <w:numPr>
           <w:ilvl w:val="0"/>
-          <w:numId w:val="1158"/>
+          <w:numId w:val="1165"/>
         </w:numPr>
       </w:pPr>
       <w:r>
@@ -13789,16 +14500,16 @@
         <w:pStyle w:val="Compact"/>
         <w:numPr>
           <w:ilvl w:val="0"/>
-          <w:numId w:val="1158"/>
+          <w:numId w:val="1165"/>
         </w:numPr>
       </w:pPr>
       <w:r>
         <w:t xml:space="preserve">Keep personal information accurate.</w:t>
       </w:r>
     </w:p>
-    <w:bookmarkEnd w:id="154"/>
     <w:bookmarkEnd w:id="155"/>
-    <w:bookmarkStart w:id="156" w:name="X0b497cb872e0ad56159a9deff5839ebfe660913"/>
+    <w:bookmarkEnd w:id="156"/>
+    <w:bookmarkStart w:id="157" w:name="X0b497cb872e0ad56159a9deff5839ebfe660913"/>
     <w:p>
       <w:pPr>
         <w:pStyle w:val="Heading2"/>
@@ -13812,7 +14523,7 @@
         <w:pStyle w:val="Compact"/>
         <w:numPr>
           <w:ilvl w:val="0"/>
-          <w:numId w:val="1159"/>
+          <w:numId w:val="1166"/>
         </w:numPr>
       </w:pPr>
       <w:r>
@@ -13824,7 +14535,7 @@
         <w:pStyle w:val="Compact"/>
         <w:numPr>
           <w:ilvl w:val="0"/>
-          <w:numId w:val="1159"/>
+          <w:numId w:val="1166"/>
         </w:numPr>
       </w:pPr>
       <w:r>
@@ -13836,7 +14547,7 @@
         <w:pStyle w:val="Compact"/>
         <w:numPr>
           <w:ilvl w:val="0"/>
-          <w:numId w:val="1159"/>
+          <w:numId w:val="1166"/>
         </w:numPr>
       </w:pPr>
       <w:r>
@@ -13848,7 +14559,7 @@
         <w:pStyle w:val="Compact"/>
         <w:numPr>
           <w:ilvl w:val="0"/>
-          <w:numId w:val="1159"/>
+          <w:numId w:val="1166"/>
         </w:numPr>
       </w:pPr>
       <w:r>
@@ -13860,15 +14571,15 @@
         <w:pStyle w:val="Compact"/>
         <w:numPr>
           <w:ilvl w:val="0"/>
-          <w:numId w:val="1159"/>
+          <w:numId w:val="1166"/>
         </w:numPr>
       </w:pPr>
       <w:r>
         <w:t xml:space="preserve">Maintain one deterministic fallback case for demos/training.</w:t>
       </w:r>
     </w:p>
-    <w:bookmarkEnd w:id="156"/>
-    <w:bookmarkStart w:id="157" w:name="X083f908630af48a74ff7521ce840aca29dd1197"/>
+    <w:bookmarkEnd w:id="157"/>
+    <w:bookmarkStart w:id="158" w:name="X083f908630af48a74ff7521ce840aca29dd1197"/>
     <w:p>
       <w:pPr>
         <w:pStyle w:val="Heading2"/>
@@ -13882,7 +14593,7 @@
         <w:pStyle w:val="Compact"/>
         <w:numPr>
           <w:ilvl w:val="0"/>
-          <w:numId w:val="1160"/>
+          <w:numId w:val="1167"/>
         </w:numPr>
       </w:pPr>
       <w:r>
@@ -13894,7 +14605,7 @@
         <w:pStyle w:val="Compact"/>
         <w:numPr>
           <w:ilvl w:val="0"/>
-          <w:numId w:val="1160"/>
+          <w:numId w:val="1167"/>
         </w:numPr>
       </w:pPr>
       <w:r>
@@ -13906,7 +14617,7 @@
         <w:pStyle w:val="Compact"/>
         <w:numPr>
           <w:ilvl w:val="0"/>
-          <w:numId w:val="1160"/>
+          <w:numId w:val="1167"/>
         </w:numPr>
       </w:pPr>
       <w:r>
@@ -13918,7 +14629,7 @@
         <w:pStyle w:val="Compact"/>
         <w:numPr>
           <w:ilvl w:val="0"/>
-          <w:numId w:val="1160"/>
+          <w:numId w:val="1167"/>
         </w:numPr>
       </w:pPr>
       <w:r>
@@ -13930,15 +14641,15 @@
         <w:pStyle w:val="Compact"/>
         <w:numPr>
           <w:ilvl w:val="0"/>
-          <w:numId w:val="1160"/>
+          <w:numId w:val="1167"/>
         </w:numPr>
       </w:pPr>
       <w:r>
         <w:t xml:space="preserve">Treat billing and background-check webhooks as high-integrity entry points.</w:t>
       </w:r>
     </w:p>
-    <w:bookmarkEnd w:id="157"/>
-    <w:bookmarkStart w:id="158" w:name="Xc06d9e5487e400efec112aa5fd7e629e9290551"/>
+    <w:bookmarkEnd w:id="158"/>
+    <w:bookmarkStart w:id="159" w:name="Xc06d9e5487e400efec112aa5fd7e629e9290551"/>
     <w:p>
       <w:pPr>
         <w:pStyle w:val="Heading2"/>
@@ -13952,7 +14663,7 @@
         <w:pStyle w:val="Compact"/>
         <w:numPr>
           <w:ilvl w:val="0"/>
-          <w:numId w:val="1161"/>
+          <w:numId w:val="1168"/>
         </w:numPr>
       </w:pPr>
       <w:r>
@@ -13964,7 +14675,7 @@
         <w:pStyle w:val="Compact"/>
         <w:numPr>
           <w:ilvl w:val="0"/>
-          <w:numId w:val="1161"/>
+          <w:numId w:val="1168"/>
         </w:numPr>
       </w:pPr>
       <w:r>
@@ -13976,7 +14687,7 @@
         <w:pStyle w:val="Compact"/>
         <w:numPr>
           <w:ilvl w:val="0"/>
-          <w:numId w:val="1161"/>
+          <w:numId w:val="1168"/>
         </w:numPr>
       </w:pPr>
       <w:r>
@@ -13988,7 +14699,7 @@
         <w:pStyle w:val="Compact"/>
         <w:numPr>
           <w:ilvl w:val="0"/>
-          <w:numId w:val="1161"/>
+          <w:numId w:val="1168"/>
         </w:numPr>
       </w:pPr>
       <w:r>
@@ -14000,15 +14711,15 @@
         <w:pStyle w:val="Compact"/>
         <w:numPr>
           <w:ilvl w:val="0"/>
-          <w:numId w:val="1161"/>
+          <w:numId w:val="1168"/>
         </w:numPr>
       </w:pPr>
       <w:r>
         <w:t xml:space="preserve">Maintain clear retention and archival policies.</w:t>
       </w:r>
     </w:p>
-    <w:bookmarkEnd w:id="158"/>
-    <w:bookmarkStart w:id="159" w:name="X2914692f3933cdc718d1ed23c9693c1ceaf6547"/>
+    <w:bookmarkEnd w:id="159"/>
+    <w:bookmarkStart w:id="160" w:name="X2914692f3933cdc718d1ed23c9693c1ceaf6547"/>
     <w:p>
       <w:pPr>
         <w:pStyle w:val="Heading2"/>
@@ -14030,7 +14741,7 @@
         <w:pStyle w:val="Compact"/>
         <w:numPr>
           <w:ilvl w:val="0"/>
-          <w:numId w:val="1162"/>
+          <w:numId w:val="1169"/>
         </w:numPr>
       </w:pPr>
       <w:r>
@@ -14057,7 +14768,7 @@
         <w:pStyle w:val="Compact"/>
         <w:numPr>
           <w:ilvl w:val="0"/>
-          <w:numId w:val="1162"/>
+          <w:numId w:val="1169"/>
         </w:numPr>
       </w:pPr>
       <w:r>
@@ -14084,7 +14795,7 @@
         <w:pStyle w:val="Compact"/>
         <w:numPr>
           <w:ilvl w:val="0"/>
-          <w:numId w:val="1162"/>
+          <w:numId w:val="1169"/>
         </w:numPr>
       </w:pPr>
       <w:r>
@@ -14096,7 +14807,7 @@
         <w:pStyle w:val="Compact"/>
         <w:numPr>
           <w:ilvl w:val="0"/>
-          <w:numId w:val="1162"/>
+          <w:numId w:val="1169"/>
         </w:numPr>
       </w:pPr>
       <w:r>
@@ -14108,7 +14819,7 @@
         <w:pStyle w:val="Compact"/>
         <w:numPr>
           <w:ilvl w:val="0"/>
-          <w:numId w:val="1162"/>
+          <w:numId w:val="1169"/>
         </w:numPr>
       </w:pPr>
       <w:r>
@@ -14122,9 +14833,9 @@
         </w:pict>
       </w:r>
     </w:p>
-    <w:bookmarkEnd w:id="159"/>
     <w:bookmarkEnd w:id="160"/>
-    <w:bookmarkStart w:id="185" w:name="Xb1320f0d17e69adbb2ac0c49f95ccd66d450ffe"/>
+    <w:bookmarkEnd w:id="161"/>
+    <w:bookmarkStart w:id="186" w:name="Xb1320f0d17e69adbb2ac0c49f95ccd66d450ffe"/>
     <w:p>
       <w:pPr>
         <w:pStyle w:val="Heading1"/>
@@ -14133,7 +14844,7 @@
         <w:t xml:space="preserve">17) Frequently Asked Questions (FAQ)</w:t>
       </w:r>
     </w:p>
-    <w:bookmarkStart w:id="164" w:name="Xcd2804e60c0a4c78e47b84f5b679e33dc19d61f"/>
+    <w:bookmarkStart w:id="165" w:name="Xcd2804e60c0a4c78e47b84f5b679e33dc19d61f"/>
     <w:p>
       <w:pPr>
         <w:pStyle w:val="Heading2"/>
@@ -14142,7 +14853,7 @@
         <w:t xml:space="preserve">17.1 Access and Accounts</w:t>
       </w:r>
     </w:p>
-    <w:bookmarkStart w:id="161" w:name="q-can-anyone-sign-up-directly"/>
+    <w:bookmarkStart w:id="162" w:name="q-can-anyone-sign-up-directly"/>
     <w:p>
       <w:pPr>
         <w:pStyle w:val="Heading3"/>
@@ -14159,8 +14870,8 @@
         <w:t xml:space="preserve">A: The recommended flow is subscription-first onboarding, then registration access based on successful subscription confirmation.</w:t>
       </w:r>
     </w:p>
-    <w:bookmarkEnd w:id="161"/>
-    <w:bookmarkStart w:id="162" w:name="q-why-am-i-redirected-to-2fa-after-login"/>
+    <w:bookmarkEnd w:id="162"/>
+    <w:bookmarkStart w:id="163" w:name="q-why-am-i-redirected-to-2fa-after-login"/>
     <w:p>
       <w:pPr>
         <w:pStyle w:val="Heading3"/>
@@ -14177,8 +14888,8 @@
         <w:t xml:space="preserve">A: Non-candidate accounts are expected to complete two-factor verification to reduce account takeover risk.</w:t>
       </w:r>
     </w:p>
-    <w:bookmarkEnd w:id="162"/>
-    <w:bookmarkStart w:id="163" w:name="q-why-can-i-not-see-admin-pages"/>
+    <w:bookmarkEnd w:id="163"/>
+    <w:bookmarkStart w:id="164" w:name="q-why-can-i-not-see-admin-pages"/>
     <w:p>
       <w:pPr>
         <w:pStyle w:val="Heading3"/>
@@ -14222,9 +14933,9 @@
         <w:t xml:space="preserve">.</w:t>
       </w:r>
     </w:p>
-    <w:bookmarkEnd w:id="163"/>
     <w:bookmarkEnd w:id="164"/>
-    <w:bookmarkStart w:id="168" w:name="Xcf4c46c7f95df57e65ec91afdd2cc306bfea387"/>
+    <w:bookmarkEnd w:id="165"/>
+    <w:bookmarkStart w:id="169" w:name="Xcf4c46c7f95df57e65ec91afdd2cc306bfea387"/>
     <w:p>
       <w:pPr>
         <w:pStyle w:val="Heading2"/>
@@ -14233,7 +14944,7 @@
         <w:t xml:space="preserve">17.2 Billing</w:t>
       </w:r>
     </w:p>
-    <w:bookmarkStart w:id="165" w:name="Xab0b9eced74bd7ff47a877f939b80bc26c053c6"/>
+    <w:bookmarkStart w:id="166" w:name="Xab0b9eced74bd7ff47a877f939b80bc26c053c6"/>
     <w:p>
       <w:pPr>
         <w:pStyle w:val="Heading3"/>
@@ -14250,8 +14961,8 @@
         <w:t xml:space="preserve">A: Unsubscribe operations are period-end cancellations by design. Service remains active until current billing period ends.</w:t>
       </w:r>
     </w:p>
-    <w:bookmarkEnd w:id="165"/>
-    <w:bookmarkStart w:id="166" w:name="Xf112e559e45e23f9d5aa3fd574d46834dcd4f56"/>
+    <w:bookmarkEnd w:id="166"/>
+    <w:bookmarkStart w:id="167" w:name="Xf112e559e45e23f9d5aa3fd574d46834dcd4f56"/>
     <w:p>
       <w:pPr>
         <w:pStyle w:val="Heading3"/>
@@ -14268,8 +14979,8 @@
         <w:t xml:space="preserve">A: Provider status can lag. Use retry confirmation and verify webhook delivery or manual confirm endpoint response.</w:t>
       </w:r>
     </w:p>
-    <w:bookmarkEnd w:id="166"/>
-    <w:bookmarkStart w:id="167" w:name="q-can-payment-method-be-changed"/>
+    <w:bookmarkEnd w:id="167"/>
+    <w:bookmarkStart w:id="168" w:name="q-can-payment-method-be-changed"/>
     <w:p>
       <w:pPr>
         <w:pStyle w:val="Heading3"/>
@@ -14286,9 +14997,9 @@
         <w:t xml:space="preserve">A: Yes, through settings billing controls. Exact path depends on provider (Stripe hosted update session vs provider-specific flow).</w:t>
       </w:r>
     </w:p>
-    <w:bookmarkEnd w:id="167"/>
     <w:bookmarkEnd w:id="168"/>
-    <w:bookmarkStart w:id="172" w:name="X6cbbf69d15bf9a89e11a4feab7b1c20803d1a33"/>
+    <w:bookmarkEnd w:id="169"/>
+    <w:bookmarkStart w:id="173" w:name="X6cbbf69d15bf9a89e11a4feab7b1c20803d1a33"/>
     <w:p>
       <w:pPr>
         <w:pStyle w:val="Heading2"/>
@@ -14297,7 +15008,7 @@
         <w:t xml:space="preserve">17.3 Campaigns and Rubrics</w:t>
       </w:r>
     </w:p>
-    <w:bookmarkStart w:id="169" w:name="q-who-should-create-rubrics"/>
+    <w:bookmarkStart w:id="170" w:name="q-who-should-create-rubrics"/>
     <w:p>
       <w:pPr>
         <w:pStyle w:val="Heading3"/>
@@ -14314,8 +15025,8 @@
         <w:t xml:space="preserve">A: HR managers typically own rubric design per campaign. Admins can oversee governance.</w:t>
       </w:r>
     </w:p>
-    <w:bookmarkEnd w:id="169"/>
-    <w:bookmarkStart w:id="170" w:name="Xb2f340e6bd1c5b0992243939eace22c9086b706"/>
+    <w:bookmarkEnd w:id="170"/>
+    <w:bookmarkStart w:id="171" w:name="Xb2f340e6bd1c5b0992243939eace22c9086b706"/>
     <w:p>
       <w:pPr>
         <w:pStyle w:val="Heading3"/>
@@ -14332,8 +15043,8 @@
         <w:t xml:space="preserve">A: Use versioning patterns. Avoid silent in-place changes that compromise auditability.</w:t>
       </w:r>
     </w:p>
-    <w:bookmarkEnd w:id="170"/>
-    <w:bookmarkStart w:id="171" w:name="Xbb5db0677a510596744bb033d9965bd1e89320e"/>
+    <w:bookmarkEnd w:id="171"/>
+    <w:bookmarkStart w:id="172" w:name="Xbb5db0677a510596744bb033d9965bd1e89320e"/>
     <w:p>
       <w:pPr>
         <w:pStyle w:val="Heading3"/>
@@ -14350,9 +15061,9 @@
         <w:t xml:space="preserve">A: The system routes low-confidence or conflicting signals for human decision.</w:t>
       </w:r>
     </w:p>
-    <w:bookmarkEnd w:id="171"/>
     <w:bookmarkEnd w:id="172"/>
-    <w:bookmarkStart w:id="175" w:name="Xa5cf15ec558542aa54a79c73661709731c792fe"/>
+    <w:bookmarkEnd w:id="173"/>
+    <w:bookmarkStart w:id="176" w:name="Xa5cf15ec558542aa54a79c73661709731c792fe"/>
     <w:p>
       <w:pPr>
         <w:pStyle w:val="Heading2"/>
@@ -14361,7 +15072,7 @@
         <w:t xml:space="preserve">17.4 Candidate Journey</w:t>
       </w:r>
     </w:p>
-    <w:bookmarkStart w:id="173" w:name="Xc51005ee56766ef3fd73022a02e0f04a9ae6c29"/>
+    <w:bookmarkStart w:id="174" w:name="Xc51005ee56766ef3fd73022a02e0f04a9ae6c29"/>
     <w:p>
       <w:pPr>
         <w:pStyle w:val="Heading3"/>
@@ -14378,8 +15089,8 @@
         <w:t xml:space="preserve">A: Check token expiry, invitation state, and enrollment link. Re-send invitation if necessary.</w:t>
       </w:r>
     </w:p>
-    <w:bookmarkEnd w:id="173"/>
-    <w:bookmarkStart w:id="174" w:name="q-can-candidate-have-a-permanent-account"/>
+    <w:bookmarkEnd w:id="174"/>
+    <w:bookmarkStart w:id="175" w:name="q-can-candidate-have-a-permanent-account"/>
     <w:p>
       <w:pPr>
         <w:pStyle w:val="Heading3"/>
@@ -14396,9 +15107,9 @@
         <w:t xml:space="preserve">A: Candidate flow is designed for scoped participation; persistent account behavior depends on your configured process policy.</w:t>
       </w:r>
     </w:p>
-    <w:bookmarkEnd w:id="174"/>
     <w:bookmarkEnd w:id="175"/>
-    <w:bookmarkStart w:id="178" w:name="Xbf3696e63f517b8475519e8a57151d312d3597d"/>
+    <w:bookmarkEnd w:id="176"/>
+    <w:bookmarkStart w:id="179" w:name="Xbf3696e63f517b8475519e8a57151d312d3597d"/>
     <w:p>
       <w:pPr>
         <w:pStyle w:val="Heading2"/>
@@ -14407,7 +15118,7 @@
         <w:t xml:space="preserve">17.5 Interviews and Video Calls</w:t>
       </w:r>
     </w:p>
-    <w:bookmarkStart w:id="176" w:name="q-why-is-meeting-join-blocked"/>
+    <w:bookmarkStart w:id="177" w:name="q-why-is-meeting-join-blocked"/>
     <w:p>
       <w:pPr>
         <w:pStyle w:val="Heading3"/>
@@ -14424,8 +15135,8 @@
         <w:t xml:space="preserve">A: Common causes include invalid meeting state, token generation failure, or LiveKit configuration issues.</w:t>
       </w:r>
     </w:p>
-    <w:bookmarkEnd w:id="176"/>
-    <w:bookmarkStart w:id="177" w:name="q-what-is-reminder-runtime-health"/>
+    <w:bookmarkEnd w:id="177"/>
+    <w:bookmarkStart w:id="178" w:name="q-what-is-reminder-runtime-health"/>
     <w:p>
       <w:pPr>
         <w:pStyle w:val="Heading3"/>
@@ -14442,9 +15153,9 @@
         <w:t xml:space="preserve">A: It indicates readiness of scheduled reminder processing pipeline (worker/beat/dependencies).</w:t>
       </w:r>
     </w:p>
-    <w:bookmarkEnd w:id="177"/>
     <w:bookmarkEnd w:id="178"/>
-    <w:bookmarkStart w:id="181" w:name="X875d55daec180a4697121ce69b9f7ac93f3f08e"/>
+    <w:bookmarkEnd w:id="179"/>
+    <w:bookmarkStart w:id="182" w:name="X875d55daec180a4697121ce69b9f7ac93f3f08e"/>
     <w:p>
       <w:pPr>
         <w:pStyle w:val="Heading2"/>
@@ -14453,7 +15164,7 @@
         <w:t xml:space="preserve">17.6 Monitoring and Audit</w:t>
       </w:r>
     </w:p>
-    <w:bookmarkStart w:id="179" w:name="q-who-should-access-aiml-monitoring"/>
+    <w:bookmarkStart w:id="180" w:name="q-who-should-access-aiml-monitoring"/>
     <w:p>
       <w:pPr>
         <w:pStyle w:val="Heading3"/>
@@ -14470,8 +15181,8 @@
         <w:t xml:space="preserve">A: Typically admins and authorized staff only.</w:t>
       </w:r>
     </w:p>
-    <w:bookmarkEnd w:id="179"/>
-    <w:bookmarkStart w:id="180" w:name="q-why-audit-logs-matter"/>
+    <w:bookmarkEnd w:id="180"/>
+    <w:bookmarkStart w:id="181" w:name="q-why-audit-logs-matter"/>
     <w:p>
       <w:pPr>
         <w:pStyle w:val="Heading3"/>
@@ -14488,9 +15199,9 @@
         <w:t xml:space="preserve">A: They preserve who did what and when, which is critical for accountability and incident reconstruction.</w:t>
       </w:r>
     </w:p>
-    <w:bookmarkEnd w:id="180"/>
     <w:bookmarkEnd w:id="181"/>
-    <w:bookmarkStart w:id="184" w:name="Xed0d90f070b3c3cb218d278d88f7a1180b8ca8a"/>
+    <w:bookmarkEnd w:id="182"/>
+    <w:bookmarkStart w:id="185" w:name="Xed0d90f070b3c3cb218d278d88f7a1180b8ca8a"/>
     <w:p>
       <w:pPr>
         <w:pStyle w:val="Heading2"/>
@@ -14499,7 +15210,7 @@
         <w:t xml:space="preserve">17.7 Background Checks</w:t>
       </w:r>
     </w:p>
-    <w:bookmarkStart w:id="182" w:name="X2db00b364e497eb2658e091ebf520fc68db07ed"/>
+    <w:bookmarkStart w:id="183" w:name="X2db00b364e497eb2658e091ebf520fc68db07ed"/>
     <w:p>
       <w:pPr>
         <w:pStyle w:val="Heading3"/>
@@ -14516,8 +15227,8 @@
         <w:t xml:space="preserve">A: It depends on configuration. Mock is suitable for development; production should use a real provider mode.</w:t>
       </w:r>
     </w:p>
-    <w:bookmarkEnd w:id="182"/>
-    <w:bookmarkStart w:id="183" w:name="q-webhook-isnt-updating-status-what-next"/>
+    <w:bookmarkEnd w:id="183"/>
+    <w:bookmarkStart w:id="184" w:name="q-webhook-isnt-updating-status-what-next"/>
     <w:p>
       <w:pPr>
         <w:pStyle w:val="Heading3"/>
@@ -14541,10 +15252,10 @@
         </w:pict>
       </w:r>
     </w:p>
-    <w:bookmarkEnd w:id="183"/>
     <w:bookmarkEnd w:id="184"/>
     <w:bookmarkEnd w:id="185"/>
-    <w:bookmarkStart w:id="195" w:name="Xe82ea43932afc42d8403a4f4b75bd015628655e"/>
+    <w:bookmarkEnd w:id="186"/>
+    <w:bookmarkStart w:id="196" w:name="Xe82ea43932afc42d8403a4f4b75bd015628655e"/>
     <w:p>
       <w:pPr>
         <w:pStyle w:val="Heading1"/>
@@ -14553,7 +15264,7 @@
         <w:t xml:space="preserve">18) Role Checklists and SOPs</w:t>
       </w:r>
     </w:p>
-    <w:bookmarkStart w:id="186" w:name="Xfe0ca4b8954dd1d8cf73735f4777136cabaeac6"/>
+    <w:bookmarkStart w:id="187" w:name="Xfe0ca4b8954dd1d8cf73735f4777136cabaeac6"/>
     <w:p>
       <w:pPr>
         <w:pStyle w:val="Heading2"/>
@@ -14567,7 +15278,7 @@
         <w:pStyle w:val="Compact"/>
         <w:numPr>
           <w:ilvl w:val="0"/>
-          <w:numId w:val="1163"/>
+          <w:numId w:val="1170"/>
         </w:numPr>
       </w:pPr>
       <w:r>
@@ -14579,7 +15290,7 @@
         <w:pStyle w:val="Compact"/>
         <w:numPr>
           <w:ilvl w:val="0"/>
-          <w:numId w:val="1163"/>
+          <w:numId w:val="1170"/>
         </w:numPr>
       </w:pPr>
       <w:r>
@@ -14591,7 +15302,7 @@
         <w:pStyle w:val="Compact"/>
         <w:numPr>
           <w:ilvl w:val="0"/>
-          <w:numId w:val="1163"/>
+          <w:numId w:val="1170"/>
         </w:numPr>
       </w:pPr>
       <w:r>
@@ -14603,7 +15314,7 @@
         <w:pStyle w:val="Compact"/>
         <w:numPr>
           <w:ilvl w:val="0"/>
-          <w:numId w:val="1163"/>
+          <w:numId w:val="1170"/>
         </w:numPr>
       </w:pPr>
       <w:r>
@@ -14615,15 +15326,15 @@
         <w:pStyle w:val="Compact"/>
         <w:numPr>
           <w:ilvl w:val="0"/>
-          <w:numId w:val="1163"/>
+          <w:numId w:val="1170"/>
         </w:numPr>
       </w:pPr>
       <w:r>
         <w:t xml:space="preserve">Confirm no critical queue backlog.</w:t>
       </w:r>
     </w:p>
-    <w:bookmarkEnd w:id="186"/>
-    <w:bookmarkStart w:id="187" w:name="Xd6933f94ed3f3b2ceca89f7b318a49856f2963c"/>
+    <w:bookmarkEnd w:id="187"/>
+    <w:bookmarkStart w:id="188" w:name="Xd6933f94ed3f3b2ceca89f7b318a49856f2963c"/>
     <w:p>
       <w:pPr>
         <w:pStyle w:val="Heading2"/>
@@ -14637,7 +15348,7 @@
         <w:pStyle w:val="Compact"/>
         <w:numPr>
           <w:ilvl w:val="0"/>
-          <w:numId w:val="1164"/>
+          <w:numId w:val="1171"/>
         </w:numPr>
       </w:pPr>
       <w:r>
@@ -14649,7 +15360,7 @@
         <w:pStyle w:val="Compact"/>
         <w:numPr>
           <w:ilvl w:val="0"/>
-          <w:numId w:val="1164"/>
+          <w:numId w:val="1171"/>
         </w:numPr>
       </w:pPr>
       <w:r>
@@ -14661,7 +15372,7 @@
         <w:pStyle w:val="Compact"/>
         <w:numPr>
           <w:ilvl w:val="0"/>
-          <w:numId w:val="1164"/>
+          <w:numId w:val="1171"/>
         </w:numPr>
       </w:pPr>
       <w:r>
@@ -14673,7 +15384,7 @@
         <w:pStyle w:val="Compact"/>
         <w:numPr>
           <w:ilvl w:val="0"/>
-          <w:numId w:val="1164"/>
+          <w:numId w:val="1171"/>
         </w:numPr>
       </w:pPr>
       <w:r>
@@ -14685,15 +15396,15 @@
         <w:pStyle w:val="Compact"/>
         <w:numPr>
           <w:ilvl w:val="0"/>
-          <w:numId w:val="1164"/>
+          <w:numId w:val="1171"/>
         </w:numPr>
       </w:pPr>
       <w:r>
         <w:t xml:space="preserve">Close decision loop with rationale notes.</w:t>
       </w:r>
     </w:p>
-    <w:bookmarkEnd w:id="187"/>
-    <w:bookmarkStart w:id="188" w:name="X0b1396f45da06887cb88e794b3adfb22c1ea72a"/>
+    <w:bookmarkEnd w:id="188"/>
+    <w:bookmarkStart w:id="189" w:name="X0b1396f45da06887cb88e794b3adfb22c1ea72a"/>
     <w:p>
       <w:pPr>
         <w:pStyle w:val="Heading2"/>
@@ -14715,7 +15426,7 @@
         <w:pStyle w:val="Compact"/>
         <w:numPr>
           <w:ilvl w:val="0"/>
-          <w:numId w:val="1165"/>
+          <w:numId w:val="1172"/>
         </w:numPr>
       </w:pPr>
       <w:r>
@@ -14727,7 +15438,7 @@
         <w:pStyle w:val="Compact"/>
         <w:numPr>
           <w:ilvl w:val="0"/>
-          <w:numId w:val="1165"/>
+          <w:numId w:val="1172"/>
         </w:numPr>
       </w:pPr>
       <w:r>
@@ -14739,7 +15450,7 @@
         <w:pStyle w:val="Compact"/>
         <w:numPr>
           <w:ilvl w:val="0"/>
-          <w:numId w:val="1165"/>
+          <w:numId w:val="1172"/>
         </w:numPr>
       </w:pPr>
       <w:r>
@@ -14751,7 +15462,7 @@
         <w:pStyle w:val="Compact"/>
         <w:numPr>
           <w:ilvl w:val="0"/>
-          <w:numId w:val="1165"/>
+          <w:numId w:val="1172"/>
         </w:numPr>
       </w:pPr>
       <w:r>
@@ -14763,15 +15474,15 @@
         <w:pStyle w:val="Compact"/>
         <w:numPr>
           <w:ilvl w:val="0"/>
-          <w:numId w:val="1165"/>
+          <w:numId w:val="1172"/>
         </w:numPr>
       </w:pPr>
       <w:r>
         <w:t xml:space="preserve">Confirm results publication state.</w:t>
       </w:r>
     </w:p>
-    <w:bookmarkEnd w:id="188"/>
-    <w:bookmarkStart w:id="189" w:name="X66539da258d14c6296e8cb75faa720a45f08c9e"/>
+    <w:bookmarkEnd w:id="189"/>
+    <w:bookmarkStart w:id="190" w:name="X66539da258d14c6296e8cb75faa720a45f08c9e"/>
     <w:p>
       <w:pPr>
         <w:pStyle w:val="Heading2"/>
@@ -14785,7 +15496,7 @@
         <w:pStyle w:val="Compact"/>
         <w:numPr>
           <w:ilvl w:val="0"/>
-          <w:numId w:val="1166"/>
+          <w:numId w:val="1173"/>
         </w:numPr>
       </w:pPr>
       <w:r>
@@ -14797,7 +15508,7 @@
         <w:pStyle w:val="Compact"/>
         <w:numPr>
           <w:ilvl w:val="0"/>
-          <w:numId w:val="1166"/>
+          <w:numId w:val="1173"/>
         </w:numPr>
       </w:pPr>
       <w:r>
@@ -14809,7 +15520,7 @@
         <w:pStyle w:val="Compact"/>
         <w:numPr>
           <w:ilvl w:val="0"/>
-          <w:numId w:val="1166"/>
+          <w:numId w:val="1173"/>
         </w:numPr>
       </w:pPr>
       <w:r>
@@ -14821,7 +15532,7 @@
         <w:pStyle w:val="Compact"/>
         <w:numPr>
           <w:ilvl w:val="1"/>
-          <w:numId w:val="1167"/>
+          <w:numId w:val="1174"/>
         </w:numPr>
       </w:pPr>
       <w:r>
@@ -14833,7 +15544,7 @@
         <w:pStyle w:val="Compact"/>
         <w:numPr>
           <w:ilvl w:val="1"/>
-          <w:numId w:val="1167"/>
+          <w:numId w:val="1174"/>
         </w:numPr>
       </w:pPr>
       <w:r>
@@ -14845,7 +15556,7 @@
         <w:pStyle w:val="Compact"/>
         <w:numPr>
           <w:ilvl w:val="1"/>
-          <w:numId w:val="1167"/>
+          <w:numId w:val="1174"/>
         </w:numPr>
       </w:pPr>
       <w:r>
@@ -14857,7 +15568,7 @@
         <w:pStyle w:val="Compact"/>
         <w:numPr>
           <w:ilvl w:val="0"/>
-          <w:numId w:val="1166"/>
+          <w:numId w:val="1173"/>
         </w:numPr>
       </w:pPr>
       <w:r>
@@ -14869,7 +15580,7 @@
         <w:pStyle w:val="Compact"/>
         <w:numPr>
           <w:ilvl w:val="1"/>
-          <w:numId w:val="1168"/>
+          <w:numId w:val="1175"/>
         </w:numPr>
       </w:pPr>
       <w:r>
@@ -14881,15 +15592,15 @@
         <w:pStyle w:val="Compact"/>
         <w:numPr>
           <w:ilvl w:val="1"/>
-          <w:numId w:val="1168"/>
+          <w:numId w:val="1175"/>
         </w:numPr>
       </w:pPr>
       <w:r>
         <w:t xml:space="preserve">communicate effective date.</w:t>
       </w:r>
     </w:p>
-    <w:bookmarkEnd w:id="189"/>
-    <w:bookmarkStart w:id="190" w:name="X2e2c637142e74bce533a2e644c03abe3ae4101f"/>
+    <w:bookmarkEnd w:id="190"/>
+    <w:bookmarkStart w:id="191" w:name="X2e2c637142e74bce533a2e644c03abe3ae4101f"/>
     <w:p>
       <w:pPr>
         <w:pStyle w:val="Heading2"/>
@@ -14903,7 +15614,7 @@
         <w:pStyle w:val="Compact"/>
         <w:numPr>
           <w:ilvl w:val="0"/>
-          <w:numId w:val="1169"/>
+          <w:numId w:val="1176"/>
         </w:numPr>
       </w:pPr>
       <w:r>
@@ -14915,7 +15626,7 @@
         <w:pStyle w:val="Compact"/>
         <w:numPr>
           <w:ilvl w:val="0"/>
-          <w:numId w:val="1169"/>
+          <w:numId w:val="1176"/>
         </w:numPr>
       </w:pPr>
       <w:r>
@@ -14927,7 +15638,7 @@
         <w:pStyle w:val="Compact"/>
         <w:numPr>
           <w:ilvl w:val="0"/>
-          <w:numId w:val="1169"/>
+          <w:numId w:val="1176"/>
         </w:numPr>
       </w:pPr>
       <w:r>
@@ -14939,7 +15650,7 @@
         <w:pStyle w:val="Compact"/>
         <w:numPr>
           <w:ilvl w:val="0"/>
-          <w:numId w:val="1169"/>
+          <w:numId w:val="1176"/>
         </w:numPr>
       </w:pPr>
       <w:r>
@@ -14951,15 +15662,15 @@
         <w:pStyle w:val="Compact"/>
         <w:numPr>
           <w:ilvl w:val="0"/>
-          <w:numId w:val="1169"/>
+          <w:numId w:val="1176"/>
         </w:numPr>
       </w:pPr>
       <w:r>
         <w:t xml:space="preserve">Reconcile delayed operations once provider recovers.</w:t>
       </w:r>
     </w:p>
-    <w:bookmarkEnd w:id="190"/>
-    <w:bookmarkStart w:id="191" w:name="X043acf6c850cc61ca3cb69eeb17755fea81182a"/>
+    <w:bookmarkEnd w:id="191"/>
+    <w:bookmarkStart w:id="192" w:name="X043acf6c850cc61ca3cb69eeb17755fea81182a"/>
     <w:p>
       <w:pPr>
         <w:pStyle w:val="Heading2"/>
@@ -14973,7 +15684,7 @@
         <w:pStyle w:val="Compact"/>
         <w:numPr>
           <w:ilvl w:val="0"/>
-          <w:numId w:val="1170"/>
+          <w:numId w:val="1177"/>
         </w:numPr>
       </w:pPr>
       <w:r>
@@ -14985,7 +15696,7 @@
         <w:pStyle w:val="Compact"/>
         <w:numPr>
           <w:ilvl w:val="0"/>
-          <w:numId w:val="1170"/>
+          <w:numId w:val="1177"/>
         </w:numPr>
       </w:pPr>
       <w:r>
@@ -14997,7 +15708,7 @@
         <w:pStyle w:val="Compact"/>
         <w:numPr>
           <w:ilvl w:val="0"/>
-          <w:numId w:val="1170"/>
+          <w:numId w:val="1177"/>
         </w:numPr>
       </w:pPr>
       <w:r>
@@ -15009,15 +15720,15 @@
         <w:pStyle w:val="Compact"/>
         <w:numPr>
           <w:ilvl w:val="0"/>
-          <w:numId w:val="1170"/>
+          <w:numId w:val="1177"/>
         </w:numPr>
       </w:pPr>
       <w:r>
         <w:t xml:space="preserve">Check login history for suspicious patterns.</w:t>
       </w:r>
     </w:p>
-    <w:bookmarkEnd w:id="191"/>
-    <w:bookmarkStart w:id="192" w:name="X7d14b480cc2816a9b372baa5ad9777692de6aa2"/>
+    <w:bookmarkEnd w:id="192"/>
+    <w:bookmarkStart w:id="193" w:name="X7d14b480cc2816a9b372baa5ad9777692de6aa2"/>
     <w:p>
       <w:pPr>
         <w:pStyle w:val="Heading2"/>
@@ -15031,7 +15742,7 @@
         <w:pStyle w:val="Compact"/>
         <w:numPr>
           <w:ilvl w:val="0"/>
-          <w:numId w:val="1171"/>
+          <w:numId w:val="1178"/>
         </w:numPr>
       </w:pPr>
       <w:r>
@@ -15043,7 +15754,7 @@
         <w:pStyle w:val="Compact"/>
         <w:numPr>
           <w:ilvl w:val="0"/>
-          <w:numId w:val="1171"/>
+          <w:numId w:val="1178"/>
         </w:numPr>
       </w:pPr>
       <w:r>
@@ -15055,7 +15766,7 @@
         <w:pStyle w:val="Compact"/>
         <w:numPr>
           <w:ilvl w:val="0"/>
-          <w:numId w:val="1171"/>
+          <w:numId w:val="1178"/>
         </w:numPr>
       </w:pPr>
       <w:r>
@@ -15067,7 +15778,7 @@
         <w:pStyle w:val="Compact"/>
         <w:numPr>
           <w:ilvl w:val="0"/>
-          <w:numId w:val="1171"/>
+          <w:numId w:val="1178"/>
         </w:numPr>
       </w:pPr>
       <w:r>
@@ -15079,15 +15790,15 @@
         <w:pStyle w:val="Compact"/>
         <w:numPr>
           <w:ilvl w:val="0"/>
-          <w:numId w:val="1171"/>
+          <w:numId w:val="1178"/>
         </w:numPr>
       </w:pPr>
       <w:r>
         <w:t xml:space="preserve">Apply controlled recovery and verify through tests.</w:t>
       </w:r>
     </w:p>
-    <w:bookmarkEnd w:id="192"/>
-    <w:bookmarkStart w:id="193" w:name="X9a882c21cde9b7b3c373afb4bc97b283182dc91"/>
+    <w:bookmarkEnd w:id="193"/>
+    <w:bookmarkStart w:id="194" w:name="X9a882c21cde9b7b3c373afb4bc97b283182dc91"/>
     <w:p>
       <w:pPr>
         <w:pStyle w:val="Heading2"/>
@@ -15101,7 +15812,7 @@
         <w:pStyle w:val="Compact"/>
         <w:numPr>
           <w:ilvl w:val="0"/>
-          <w:numId w:val="1172"/>
+          <w:numId w:val="1179"/>
         </w:numPr>
       </w:pPr>
       <w:r>
@@ -15113,7 +15824,7 @@
         <w:pStyle w:val="Compact"/>
         <w:numPr>
           <w:ilvl w:val="0"/>
-          <w:numId w:val="1172"/>
+          <w:numId w:val="1179"/>
         </w:numPr>
       </w:pPr>
       <w:r>
@@ -15125,7 +15836,7 @@
         <w:pStyle w:val="Compact"/>
         <w:numPr>
           <w:ilvl w:val="0"/>
-          <w:numId w:val="1172"/>
+          <w:numId w:val="1179"/>
         </w:numPr>
       </w:pPr>
       <w:r>
@@ -15137,7 +15848,7 @@
         <w:pStyle w:val="Compact"/>
         <w:numPr>
           <w:ilvl w:val="0"/>
-          <w:numId w:val="1172"/>
+          <w:numId w:val="1179"/>
         </w:numPr>
       </w:pPr>
       <w:r>
@@ -15149,15 +15860,15 @@
         <w:pStyle w:val="Compact"/>
         <w:numPr>
           <w:ilvl w:val="0"/>
-          <w:numId w:val="1172"/>
+          <w:numId w:val="1179"/>
         </w:numPr>
       </w:pPr>
       <w:r>
         <w:t xml:space="preserve">Confirm rollback plan and backup availability.</w:t>
       </w:r>
     </w:p>
-    <w:bookmarkEnd w:id="193"/>
-    <w:bookmarkStart w:id="194" w:name="X6ec969e21858e381fe1764ff3f07cf30f8afa49"/>
+    <w:bookmarkEnd w:id="194"/>
+    <w:bookmarkStart w:id="195" w:name="X6ec969e21858e381fe1764ff3f07cf30f8afa49"/>
     <w:p>
       <w:pPr>
         <w:pStyle w:val="Heading2"/>
@@ -15171,7 +15882,7 @@
         <w:pStyle w:val="Compact"/>
         <w:numPr>
           <w:ilvl w:val="0"/>
-          <w:numId w:val="1173"/>
+          <w:numId w:val="1180"/>
         </w:numPr>
       </w:pPr>
       <w:r>
@@ -15183,7 +15894,7 @@
         <w:pStyle w:val="Compact"/>
         <w:numPr>
           <w:ilvl w:val="0"/>
-          <w:numId w:val="1173"/>
+          <w:numId w:val="1180"/>
         </w:numPr>
       </w:pPr>
       <w:r>
@@ -15195,7 +15906,7 @@
         <w:pStyle w:val="Compact"/>
         <w:numPr>
           <w:ilvl w:val="0"/>
-          <w:numId w:val="1173"/>
+          <w:numId w:val="1180"/>
         </w:numPr>
       </w:pPr>
       <w:r>
@@ -15207,7 +15918,7 @@
         <w:pStyle w:val="Compact"/>
         <w:numPr>
           <w:ilvl w:val="0"/>
-          <w:numId w:val="1173"/>
+          <w:numId w:val="1180"/>
         </w:numPr>
       </w:pPr>
       <w:r>
@@ -15219,7 +15930,7 @@
         <w:pStyle w:val="Compact"/>
         <w:numPr>
           <w:ilvl w:val="0"/>
-          <w:numId w:val="1173"/>
+          <w:numId w:val="1180"/>
         </w:numPr>
       </w:pPr>
       <w:r>
@@ -15241,8 +15952,8 @@
         <w:t xml:space="preserve">order if interrupted.</w:t>
       </w:r>
     </w:p>
-    <w:bookmarkEnd w:id="194"/>
     <w:bookmarkEnd w:id="195"/>
+    <w:bookmarkEnd w:id="196"/>
     <w:sectPr>
       <w:footnotePr>
         <w:numRestart w:val="eachSect"/>
@@ -16586,43 +17297,70 @@
     <w:abstractNumId w:val="991"/>
   </w:num>
   <w:num w:numId="1123">
-    <w:abstractNumId w:val="991"/>
+    <w:abstractNumId w:val="99411"/>
+    <w:lvlOverride w:ilvl="0">
+      <w:startOverride w:val="1"/>
+    </w:lvlOverride>
+    <w:lvlOverride w:ilvl="1">
+      <w:startOverride w:val="1"/>
+    </w:lvlOverride>
+    <w:lvlOverride w:ilvl="2">
+      <w:startOverride w:val="1"/>
+    </w:lvlOverride>
+    <w:lvlOverride w:ilvl="3">
+      <w:startOverride w:val="1"/>
+    </w:lvlOverride>
+    <w:lvlOverride w:ilvl="4">
+      <w:startOverride w:val="1"/>
+    </w:lvlOverride>
+    <w:lvlOverride w:ilvl="5">
+      <w:startOverride w:val="1"/>
+    </w:lvlOverride>
+    <w:lvlOverride w:ilvl="6">
+      <w:startOverride w:val="1"/>
+    </w:lvlOverride>
+    <w:lvlOverride w:ilvl="7">
+      <w:startOverride w:val="1"/>
+    </w:lvlOverride>
+    <w:lvlOverride w:ilvl="8">
+      <w:startOverride w:val="1"/>
+    </w:lvlOverride>
   </w:num>
   <w:num w:numId="1124">
-    <w:abstractNumId w:val="99411"/>
-    <w:lvlOverride w:ilvl="0">
-      <w:startOverride w:val="1"/>
-    </w:lvlOverride>
-    <w:lvlOverride w:ilvl="1">
-      <w:startOverride w:val="1"/>
-    </w:lvlOverride>
-    <w:lvlOverride w:ilvl="2">
-      <w:startOverride w:val="1"/>
-    </w:lvlOverride>
-    <w:lvlOverride w:ilvl="3">
-      <w:startOverride w:val="1"/>
-    </w:lvlOverride>
-    <w:lvlOverride w:ilvl="4">
-      <w:startOverride w:val="1"/>
-    </w:lvlOverride>
-    <w:lvlOverride w:ilvl="5">
-      <w:startOverride w:val="1"/>
-    </w:lvlOverride>
-    <w:lvlOverride w:ilvl="6">
-      <w:startOverride w:val="1"/>
-    </w:lvlOverride>
-    <w:lvlOverride w:ilvl="7">
-      <w:startOverride w:val="1"/>
-    </w:lvlOverride>
-    <w:lvlOverride w:ilvl="8">
-      <w:startOverride w:val="1"/>
-    </w:lvlOverride>
+    <w:abstractNumId w:val="991"/>
   </w:num>
   <w:num w:numId="1125">
     <w:abstractNumId w:val="991"/>
   </w:num>
   <w:num w:numId="1126">
-    <w:abstractNumId w:val="991"/>
+    <w:abstractNumId w:val="99411"/>
+    <w:lvlOverride w:ilvl="0">
+      <w:startOverride w:val="1"/>
+    </w:lvlOverride>
+    <w:lvlOverride w:ilvl="1">
+      <w:startOverride w:val="1"/>
+    </w:lvlOverride>
+    <w:lvlOverride w:ilvl="2">
+      <w:startOverride w:val="1"/>
+    </w:lvlOverride>
+    <w:lvlOverride w:ilvl="3">
+      <w:startOverride w:val="1"/>
+    </w:lvlOverride>
+    <w:lvlOverride w:ilvl="4">
+      <w:startOverride w:val="1"/>
+    </w:lvlOverride>
+    <w:lvlOverride w:ilvl="5">
+      <w:startOverride w:val="1"/>
+    </w:lvlOverride>
+    <w:lvlOverride w:ilvl="6">
+      <w:startOverride w:val="1"/>
+    </w:lvlOverride>
+    <w:lvlOverride w:ilvl="7">
+      <w:startOverride w:val="1"/>
+    </w:lvlOverride>
+    <w:lvlOverride w:ilvl="8">
+      <w:startOverride w:val="1"/>
+    </w:lvlOverride>
   </w:num>
   <w:num w:numId="1127">
     <w:abstractNumId w:val="991"/>
@@ -16631,64 +17369,10 @@
     <w:abstractNumId w:val="991"/>
   </w:num>
   <w:num w:numId="1129">
-    <w:abstractNumId w:val="99411"/>
-    <w:lvlOverride w:ilvl="0">
-      <w:startOverride w:val="1"/>
-    </w:lvlOverride>
-    <w:lvlOverride w:ilvl="1">
-      <w:startOverride w:val="1"/>
-    </w:lvlOverride>
-    <w:lvlOverride w:ilvl="2">
-      <w:startOverride w:val="1"/>
-    </w:lvlOverride>
-    <w:lvlOverride w:ilvl="3">
-      <w:startOverride w:val="1"/>
-    </w:lvlOverride>
-    <w:lvlOverride w:ilvl="4">
-      <w:startOverride w:val="1"/>
-    </w:lvlOverride>
-    <w:lvlOverride w:ilvl="5">
-      <w:startOverride w:val="1"/>
-    </w:lvlOverride>
-    <w:lvlOverride w:ilvl="6">
-      <w:startOverride w:val="1"/>
-    </w:lvlOverride>
-    <w:lvlOverride w:ilvl="7">
-      <w:startOverride w:val="1"/>
-    </w:lvlOverride>
-    <w:lvlOverride w:ilvl="8">
-      <w:startOverride w:val="1"/>
-    </w:lvlOverride>
+    <w:abstractNumId w:val="991"/>
   </w:num>
   <w:num w:numId="1130">
-    <w:abstractNumId w:val="99411"/>
-    <w:lvlOverride w:ilvl="0">
-      <w:startOverride w:val="1"/>
-    </w:lvlOverride>
-    <w:lvlOverride w:ilvl="1">
-      <w:startOverride w:val="1"/>
-    </w:lvlOverride>
-    <w:lvlOverride w:ilvl="2">
-      <w:startOverride w:val="1"/>
-    </w:lvlOverride>
-    <w:lvlOverride w:ilvl="3">
-      <w:startOverride w:val="1"/>
-    </w:lvlOverride>
-    <w:lvlOverride w:ilvl="4">
-      <w:startOverride w:val="1"/>
-    </w:lvlOverride>
-    <w:lvlOverride w:ilvl="5">
-      <w:startOverride w:val="1"/>
-    </w:lvlOverride>
-    <w:lvlOverride w:ilvl="6">
-      <w:startOverride w:val="1"/>
-    </w:lvlOverride>
-    <w:lvlOverride w:ilvl="7">
-      <w:startOverride w:val="1"/>
-    </w:lvlOverride>
-    <w:lvlOverride w:ilvl="8">
-      <w:startOverride w:val="1"/>
-    </w:lvlOverride>
+    <w:abstractNumId w:val="991"/>
   </w:num>
   <w:num w:numId="1131">
     <w:abstractNumId w:val="99411"/>
@@ -16991,10 +17675,64 @@
     </w:lvlOverride>
   </w:num>
   <w:num w:numId="1141">
-    <w:abstractNumId w:val="991"/>
+    <w:abstractNumId w:val="99411"/>
+    <w:lvlOverride w:ilvl="0">
+      <w:startOverride w:val="1"/>
+    </w:lvlOverride>
+    <w:lvlOverride w:ilvl="1">
+      <w:startOverride w:val="1"/>
+    </w:lvlOverride>
+    <w:lvlOverride w:ilvl="2">
+      <w:startOverride w:val="1"/>
+    </w:lvlOverride>
+    <w:lvlOverride w:ilvl="3">
+      <w:startOverride w:val="1"/>
+    </w:lvlOverride>
+    <w:lvlOverride w:ilvl="4">
+      <w:startOverride w:val="1"/>
+    </w:lvlOverride>
+    <w:lvlOverride w:ilvl="5">
+      <w:startOverride w:val="1"/>
+    </w:lvlOverride>
+    <w:lvlOverride w:ilvl="6">
+      <w:startOverride w:val="1"/>
+    </w:lvlOverride>
+    <w:lvlOverride w:ilvl="7">
+      <w:startOverride w:val="1"/>
+    </w:lvlOverride>
+    <w:lvlOverride w:ilvl="8">
+      <w:startOverride w:val="1"/>
+    </w:lvlOverride>
   </w:num>
   <w:num w:numId="1142">
-    <w:abstractNumId w:val="991"/>
+    <w:abstractNumId w:val="99411"/>
+    <w:lvlOverride w:ilvl="0">
+      <w:startOverride w:val="1"/>
+    </w:lvlOverride>
+    <w:lvlOverride w:ilvl="1">
+      <w:startOverride w:val="1"/>
+    </w:lvlOverride>
+    <w:lvlOverride w:ilvl="2">
+      <w:startOverride w:val="1"/>
+    </w:lvlOverride>
+    <w:lvlOverride w:ilvl="3">
+      <w:startOverride w:val="1"/>
+    </w:lvlOverride>
+    <w:lvlOverride w:ilvl="4">
+      <w:startOverride w:val="1"/>
+    </w:lvlOverride>
+    <w:lvlOverride w:ilvl="5">
+      <w:startOverride w:val="1"/>
+    </w:lvlOverride>
+    <w:lvlOverride w:ilvl="6">
+      <w:startOverride w:val="1"/>
+    </w:lvlOverride>
+    <w:lvlOverride w:ilvl="7">
+      <w:startOverride w:val="1"/>
+    </w:lvlOverride>
+    <w:lvlOverride w:ilvl="8">
+      <w:startOverride w:val="1"/>
+    </w:lvlOverride>
   </w:num>
   <w:num w:numId="1143">
     <w:abstractNumId w:val="991"/>
@@ -17036,214 +17774,25 @@
     <w:abstractNumId w:val="991"/>
   </w:num>
   <w:num w:numId="1156">
-    <w:abstractNumId w:val="99411"/>
-    <w:lvlOverride w:ilvl="0">
-      <w:startOverride w:val="1"/>
-    </w:lvlOverride>
-    <w:lvlOverride w:ilvl="1">
-      <w:startOverride w:val="1"/>
-    </w:lvlOverride>
-    <w:lvlOverride w:ilvl="2">
-      <w:startOverride w:val="1"/>
-    </w:lvlOverride>
-    <w:lvlOverride w:ilvl="3">
-      <w:startOverride w:val="1"/>
-    </w:lvlOverride>
-    <w:lvlOverride w:ilvl="4">
-      <w:startOverride w:val="1"/>
-    </w:lvlOverride>
-    <w:lvlOverride w:ilvl="5">
-      <w:startOverride w:val="1"/>
-    </w:lvlOverride>
-    <w:lvlOverride w:ilvl="6">
-      <w:startOverride w:val="1"/>
-    </w:lvlOverride>
-    <w:lvlOverride w:ilvl="7">
-      <w:startOverride w:val="1"/>
-    </w:lvlOverride>
-    <w:lvlOverride w:ilvl="8">
-      <w:startOverride w:val="1"/>
-    </w:lvlOverride>
+    <w:abstractNumId w:val="991"/>
   </w:num>
   <w:num w:numId="1157">
-    <w:abstractNumId w:val="99411"/>
-    <w:lvlOverride w:ilvl="0">
-      <w:startOverride w:val="1"/>
-    </w:lvlOverride>
-    <w:lvlOverride w:ilvl="1">
-      <w:startOverride w:val="1"/>
-    </w:lvlOverride>
-    <w:lvlOverride w:ilvl="2">
-      <w:startOverride w:val="1"/>
-    </w:lvlOverride>
-    <w:lvlOverride w:ilvl="3">
-      <w:startOverride w:val="1"/>
-    </w:lvlOverride>
-    <w:lvlOverride w:ilvl="4">
-      <w:startOverride w:val="1"/>
-    </w:lvlOverride>
-    <w:lvlOverride w:ilvl="5">
-      <w:startOverride w:val="1"/>
-    </w:lvlOverride>
-    <w:lvlOverride w:ilvl="6">
-      <w:startOverride w:val="1"/>
-    </w:lvlOverride>
-    <w:lvlOverride w:ilvl="7">
-      <w:startOverride w:val="1"/>
-    </w:lvlOverride>
-    <w:lvlOverride w:ilvl="8">
-      <w:startOverride w:val="1"/>
-    </w:lvlOverride>
+    <w:abstractNumId w:val="991"/>
   </w:num>
   <w:num w:numId="1158">
-    <w:abstractNumId w:val="99411"/>
-    <w:lvlOverride w:ilvl="0">
-      <w:startOverride w:val="1"/>
-    </w:lvlOverride>
-    <w:lvlOverride w:ilvl="1">
-      <w:startOverride w:val="1"/>
-    </w:lvlOverride>
-    <w:lvlOverride w:ilvl="2">
-      <w:startOverride w:val="1"/>
-    </w:lvlOverride>
-    <w:lvlOverride w:ilvl="3">
-      <w:startOverride w:val="1"/>
-    </w:lvlOverride>
-    <w:lvlOverride w:ilvl="4">
-      <w:startOverride w:val="1"/>
-    </w:lvlOverride>
-    <w:lvlOverride w:ilvl="5">
-      <w:startOverride w:val="1"/>
-    </w:lvlOverride>
-    <w:lvlOverride w:ilvl="6">
-      <w:startOverride w:val="1"/>
-    </w:lvlOverride>
-    <w:lvlOverride w:ilvl="7">
-      <w:startOverride w:val="1"/>
-    </w:lvlOverride>
-    <w:lvlOverride w:ilvl="8">
-      <w:startOverride w:val="1"/>
-    </w:lvlOverride>
+    <w:abstractNumId w:val="991"/>
   </w:num>
   <w:num w:numId="1159">
-    <w:abstractNumId w:val="99411"/>
-    <w:lvlOverride w:ilvl="0">
-      <w:startOverride w:val="1"/>
-    </w:lvlOverride>
-    <w:lvlOverride w:ilvl="1">
-      <w:startOverride w:val="1"/>
-    </w:lvlOverride>
-    <w:lvlOverride w:ilvl="2">
-      <w:startOverride w:val="1"/>
-    </w:lvlOverride>
-    <w:lvlOverride w:ilvl="3">
-      <w:startOverride w:val="1"/>
-    </w:lvlOverride>
-    <w:lvlOverride w:ilvl="4">
-      <w:startOverride w:val="1"/>
-    </w:lvlOverride>
-    <w:lvlOverride w:ilvl="5">
-      <w:startOverride w:val="1"/>
-    </w:lvlOverride>
-    <w:lvlOverride w:ilvl="6">
-      <w:startOverride w:val="1"/>
-    </w:lvlOverride>
-    <w:lvlOverride w:ilvl="7">
-      <w:startOverride w:val="1"/>
-    </w:lvlOverride>
-    <w:lvlOverride w:ilvl="8">
-      <w:startOverride w:val="1"/>
-    </w:lvlOverride>
+    <w:abstractNumId w:val="991"/>
   </w:num>
   <w:num w:numId="1160">
-    <w:abstractNumId w:val="99411"/>
-    <w:lvlOverride w:ilvl="0">
-      <w:startOverride w:val="1"/>
-    </w:lvlOverride>
-    <w:lvlOverride w:ilvl="1">
-      <w:startOverride w:val="1"/>
-    </w:lvlOverride>
-    <w:lvlOverride w:ilvl="2">
-      <w:startOverride w:val="1"/>
-    </w:lvlOverride>
-    <w:lvlOverride w:ilvl="3">
-      <w:startOverride w:val="1"/>
-    </w:lvlOverride>
-    <w:lvlOverride w:ilvl="4">
-      <w:startOverride w:val="1"/>
-    </w:lvlOverride>
-    <w:lvlOverride w:ilvl="5">
-      <w:startOverride w:val="1"/>
-    </w:lvlOverride>
-    <w:lvlOverride w:ilvl="6">
-      <w:startOverride w:val="1"/>
-    </w:lvlOverride>
-    <w:lvlOverride w:ilvl="7">
-      <w:startOverride w:val="1"/>
-    </w:lvlOverride>
-    <w:lvlOverride w:ilvl="8">
-      <w:startOverride w:val="1"/>
-    </w:lvlOverride>
+    <w:abstractNumId w:val="991"/>
   </w:num>
   <w:num w:numId="1161">
-    <w:abstractNumId w:val="99411"/>
-    <w:lvlOverride w:ilvl="0">
-      <w:startOverride w:val="1"/>
-    </w:lvlOverride>
-    <w:lvlOverride w:ilvl="1">
-      <w:startOverride w:val="1"/>
-    </w:lvlOverride>
-    <w:lvlOverride w:ilvl="2">
-      <w:startOverride w:val="1"/>
-    </w:lvlOverride>
-    <w:lvlOverride w:ilvl="3">
-      <w:startOverride w:val="1"/>
-    </w:lvlOverride>
-    <w:lvlOverride w:ilvl="4">
-      <w:startOverride w:val="1"/>
-    </w:lvlOverride>
-    <w:lvlOverride w:ilvl="5">
-      <w:startOverride w:val="1"/>
-    </w:lvlOverride>
-    <w:lvlOverride w:ilvl="6">
-      <w:startOverride w:val="1"/>
-    </w:lvlOverride>
-    <w:lvlOverride w:ilvl="7">
-      <w:startOverride w:val="1"/>
-    </w:lvlOverride>
-    <w:lvlOverride w:ilvl="8">
-      <w:startOverride w:val="1"/>
-    </w:lvlOverride>
+    <w:abstractNumId w:val="991"/>
   </w:num>
   <w:num w:numId="1162">
-    <w:abstractNumId w:val="99411"/>
-    <w:lvlOverride w:ilvl="0">
-      <w:startOverride w:val="1"/>
-    </w:lvlOverride>
-    <w:lvlOverride w:ilvl="1">
-      <w:startOverride w:val="1"/>
-    </w:lvlOverride>
-    <w:lvlOverride w:ilvl="2">
-      <w:startOverride w:val="1"/>
-    </w:lvlOverride>
-    <w:lvlOverride w:ilvl="3">
-      <w:startOverride w:val="1"/>
-    </w:lvlOverride>
-    <w:lvlOverride w:ilvl="4">
-      <w:startOverride w:val="1"/>
-    </w:lvlOverride>
-    <w:lvlOverride w:ilvl="5">
-      <w:startOverride w:val="1"/>
-    </w:lvlOverride>
-    <w:lvlOverride w:ilvl="6">
-      <w:startOverride w:val="1"/>
-    </w:lvlOverride>
-    <w:lvlOverride w:ilvl="7">
-      <w:startOverride w:val="1"/>
-    </w:lvlOverride>
-    <w:lvlOverride w:ilvl="8">
-      <w:startOverride w:val="1"/>
-    </w:lvlOverride>
+    <w:abstractNumId w:val="991"/>
   </w:num>
   <w:num w:numId="1163">
     <w:abstractNumId w:val="99411"/>
@@ -17366,10 +17915,64 @@
     </w:lvlOverride>
   </w:num>
   <w:num w:numId="1167">
-    <w:abstractNumId w:val="991"/>
+    <w:abstractNumId w:val="99411"/>
+    <w:lvlOverride w:ilvl="0">
+      <w:startOverride w:val="1"/>
+    </w:lvlOverride>
+    <w:lvlOverride w:ilvl="1">
+      <w:startOverride w:val="1"/>
+    </w:lvlOverride>
+    <w:lvlOverride w:ilvl="2">
+      <w:startOverride w:val="1"/>
+    </w:lvlOverride>
+    <w:lvlOverride w:ilvl="3">
+      <w:startOverride w:val="1"/>
+    </w:lvlOverride>
+    <w:lvlOverride w:ilvl="4">
+      <w:startOverride w:val="1"/>
+    </w:lvlOverride>
+    <w:lvlOverride w:ilvl="5">
+      <w:startOverride w:val="1"/>
+    </w:lvlOverride>
+    <w:lvlOverride w:ilvl="6">
+      <w:startOverride w:val="1"/>
+    </w:lvlOverride>
+    <w:lvlOverride w:ilvl="7">
+      <w:startOverride w:val="1"/>
+    </w:lvlOverride>
+    <w:lvlOverride w:ilvl="8">
+      <w:startOverride w:val="1"/>
+    </w:lvlOverride>
   </w:num>
   <w:num w:numId="1168">
-    <w:abstractNumId w:val="991"/>
+    <w:abstractNumId w:val="99411"/>
+    <w:lvlOverride w:ilvl="0">
+      <w:startOverride w:val="1"/>
+    </w:lvlOverride>
+    <w:lvlOverride w:ilvl="1">
+      <w:startOverride w:val="1"/>
+    </w:lvlOverride>
+    <w:lvlOverride w:ilvl="2">
+      <w:startOverride w:val="1"/>
+    </w:lvlOverride>
+    <w:lvlOverride w:ilvl="3">
+      <w:startOverride w:val="1"/>
+    </w:lvlOverride>
+    <w:lvlOverride w:ilvl="4">
+      <w:startOverride w:val="1"/>
+    </w:lvlOverride>
+    <w:lvlOverride w:ilvl="5">
+      <w:startOverride w:val="1"/>
+    </w:lvlOverride>
+    <w:lvlOverride w:ilvl="6">
+      <w:startOverride w:val="1"/>
+    </w:lvlOverride>
+    <w:lvlOverride w:ilvl="7">
+      <w:startOverride w:val="1"/>
+    </w:lvlOverride>
+    <w:lvlOverride w:ilvl="8">
+      <w:startOverride w:val="1"/>
+    </w:lvlOverride>
   </w:num>
   <w:num w:numId="1169">
     <w:abstractNumId w:val="99411"/>
@@ -17492,6 +18095,162 @@
     </w:lvlOverride>
   </w:num>
   <w:num w:numId="1173">
+    <w:abstractNumId w:val="99411"/>
+    <w:lvlOverride w:ilvl="0">
+      <w:startOverride w:val="1"/>
+    </w:lvlOverride>
+    <w:lvlOverride w:ilvl="1">
+      <w:startOverride w:val="1"/>
+    </w:lvlOverride>
+    <w:lvlOverride w:ilvl="2">
+      <w:startOverride w:val="1"/>
+    </w:lvlOverride>
+    <w:lvlOverride w:ilvl="3">
+      <w:startOverride w:val="1"/>
+    </w:lvlOverride>
+    <w:lvlOverride w:ilvl="4">
+      <w:startOverride w:val="1"/>
+    </w:lvlOverride>
+    <w:lvlOverride w:ilvl="5">
+      <w:startOverride w:val="1"/>
+    </w:lvlOverride>
+    <w:lvlOverride w:ilvl="6">
+      <w:startOverride w:val="1"/>
+    </w:lvlOverride>
+    <w:lvlOverride w:ilvl="7">
+      <w:startOverride w:val="1"/>
+    </w:lvlOverride>
+    <w:lvlOverride w:ilvl="8">
+      <w:startOverride w:val="1"/>
+    </w:lvlOverride>
+  </w:num>
+  <w:num w:numId="1174">
+    <w:abstractNumId w:val="991"/>
+  </w:num>
+  <w:num w:numId="1175">
+    <w:abstractNumId w:val="991"/>
+  </w:num>
+  <w:num w:numId="1176">
+    <w:abstractNumId w:val="99411"/>
+    <w:lvlOverride w:ilvl="0">
+      <w:startOverride w:val="1"/>
+    </w:lvlOverride>
+    <w:lvlOverride w:ilvl="1">
+      <w:startOverride w:val="1"/>
+    </w:lvlOverride>
+    <w:lvlOverride w:ilvl="2">
+      <w:startOverride w:val="1"/>
+    </w:lvlOverride>
+    <w:lvlOverride w:ilvl="3">
+      <w:startOverride w:val="1"/>
+    </w:lvlOverride>
+    <w:lvlOverride w:ilvl="4">
+      <w:startOverride w:val="1"/>
+    </w:lvlOverride>
+    <w:lvlOverride w:ilvl="5">
+      <w:startOverride w:val="1"/>
+    </w:lvlOverride>
+    <w:lvlOverride w:ilvl="6">
+      <w:startOverride w:val="1"/>
+    </w:lvlOverride>
+    <w:lvlOverride w:ilvl="7">
+      <w:startOverride w:val="1"/>
+    </w:lvlOverride>
+    <w:lvlOverride w:ilvl="8">
+      <w:startOverride w:val="1"/>
+    </w:lvlOverride>
+  </w:num>
+  <w:num w:numId="1177">
+    <w:abstractNumId w:val="99411"/>
+    <w:lvlOverride w:ilvl="0">
+      <w:startOverride w:val="1"/>
+    </w:lvlOverride>
+    <w:lvlOverride w:ilvl="1">
+      <w:startOverride w:val="1"/>
+    </w:lvlOverride>
+    <w:lvlOverride w:ilvl="2">
+      <w:startOverride w:val="1"/>
+    </w:lvlOverride>
+    <w:lvlOverride w:ilvl="3">
+      <w:startOverride w:val="1"/>
+    </w:lvlOverride>
+    <w:lvlOverride w:ilvl="4">
+      <w:startOverride w:val="1"/>
+    </w:lvlOverride>
+    <w:lvlOverride w:ilvl="5">
+      <w:startOverride w:val="1"/>
+    </w:lvlOverride>
+    <w:lvlOverride w:ilvl="6">
+      <w:startOverride w:val="1"/>
+    </w:lvlOverride>
+    <w:lvlOverride w:ilvl="7">
+      <w:startOverride w:val="1"/>
+    </w:lvlOverride>
+    <w:lvlOverride w:ilvl="8">
+      <w:startOverride w:val="1"/>
+    </w:lvlOverride>
+  </w:num>
+  <w:num w:numId="1178">
+    <w:abstractNumId w:val="99411"/>
+    <w:lvlOverride w:ilvl="0">
+      <w:startOverride w:val="1"/>
+    </w:lvlOverride>
+    <w:lvlOverride w:ilvl="1">
+      <w:startOverride w:val="1"/>
+    </w:lvlOverride>
+    <w:lvlOverride w:ilvl="2">
+      <w:startOverride w:val="1"/>
+    </w:lvlOverride>
+    <w:lvlOverride w:ilvl="3">
+      <w:startOverride w:val="1"/>
+    </w:lvlOverride>
+    <w:lvlOverride w:ilvl="4">
+      <w:startOverride w:val="1"/>
+    </w:lvlOverride>
+    <w:lvlOverride w:ilvl="5">
+      <w:startOverride w:val="1"/>
+    </w:lvlOverride>
+    <w:lvlOverride w:ilvl="6">
+      <w:startOverride w:val="1"/>
+    </w:lvlOverride>
+    <w:lvlOverride w:ilvl="7">
+      <w:startOverride w:val="1"/>
+    </w:lvlOverride>
+    <w:lvlOverride w:ilvl="8">
+      <w:startOverride w:val="1"/>
+    </w:lvlOverride>
+  </w:num>
+  <w:num w:numId="1179">
+    <w:abstractNumId w:val="99411"/>
+    <w:lvlOverride w:ilvl="0">
+      <w:startOverride w:val="1"/>
+    </w:lvlOverride>
+    <w:lvlOverride w:ilvl="1">
+      <w:startOverride w:val="1"/>
+    </w:lvlOverride>
+    <w:lvlOverride w:ilvl="2">
+      <w:startOverride w:val="1"/>
+    </w:lvlOverride>
+    <w:lvlOverride w:ilvl="3">
+      <w:startOverride w:val="1"/>
+    </w:lvlOverride>
+    <w:lvlOverride w:ilvl="4">
+      <w:startOverride w:val="1"/>
+    </w:lvlOverride>
+    <w:lvlOverride w:ilvl="5">
+      <w:startOverride w:val="1"/>
+    </w:lvlOverride>
+    <w:lvlOverride w:ilvl="6">
+      <w:startOverride w:val="1"/>
+    </w:lvlOverride>
+    <w:lvlOverride w:ilvl="7">
+      <w:startOverride w:val="1"/>
+    </w:lvlOverride>
+    <w:lvlOverride w:ilvl="8">
+      <w:startOverride w:val="1"/>
+    </w:lvlOverride>
+  </w:num>
+  <w:num w:numId="1180">
     <w:abstractNumId w:val="99411"/>
     <w:lvlOverride w:ilvl="0">
       <w:startOverride w:val="1"/>

</xml_diff>